<commit_message>
Add the three 5-box flow diagrams to the refined proposal
- Current OpenSearch Indexing Flow (As-Is), Option 1 (RAG) flow, Option 2 (Agentic) flow
- Rendered three ways: styled colored boxes in .docx (horizontal flow tables) and .html,
  plus Mermaid flowcharts that render natively on GitHub
- Flow source kept in PROPOSAL.md as a ::flow:: block wrapped in an HTML comment so GitHub
  shows only the Mermaid diagram; build_docx.py / build_html.py unwrap + render it
- All existing tables retained; docx valid Microsoft Word 2007+; no syntax leaked
</commit_message>
<xml_diff>
--- a/sparks-ai-search/SPARKS_AI_Search_Proposal.docx
+++ b/sparks-ai-search/SPARKS_AI_Search_Proposal.docx
@@ -330,6 +330,340 @@
       </w:r>
     </w:p>
     <w:p>
+      <w:r>
+        <w:rPr>
+          <w:b/>
+        </w:rPr>
+        <w:t xml:space="preserve">SPARKS Current OpenSearch Indexing Flow</w:t>
+      </w:r>
+      <w:r>
+        <w:t xml:space="preserve"> — *existing production pattern, unchanged by the AI proposal:*</w:t>
+      </w:r>
+    </w:p>
+    <w:p>
+      <w:pPr>
+        <w:jc w:val="center"/>
+        <w:spacing w:before="120" w:after="80"/>
+      </w:pPr>
+      <w:r>
+        <w:rPr>
+          <w:b/>
+          <w:color w:val="1F3864"/>
+          <w:sz w:val="24"/>
+        </w:rPr>
+        <w:t xml:space="preserve">Current OpenSearch Indexing Flow</w:t>
+      </w:r>
+    </w:p>
+    <w:tbl>
+      <w:tblPr>
+        <w:tblW w:w="5000" w:type="pct"/>
+        <w:tblLayout w:type="fixed"/>
+        <w:jc w:val="center"/>
+      </w:tblPr>
+      <w:tblGrid>
+        <w:gridCol/>
+        <w:gridCol/>
+        <w:gridCol/>
+        <w:gridCol/>
+        <w:gridCol/>
+        <w:gridCol/>
+        <w:gridCol/>
+        <w:gridCol/>
+        <w:gridCol/>
+      </w:tblGrid>
+      <w:tr>
+        <w:tc>
+          <w:tcPr>
+            <w:tcW w:w="0" w:type="auto"/>
+            <w:shd w:val="clear" w:fill="DAE8FC"/>
+            <w:tcBorders>
+              <w:top w:val="single" w:sz="12" w:color="6C8EBF"/>
+              <w:left w:val="single" w:sz="12" w:color="6C8EBF"/>
+              <w:bottom w:val="single" w:sz="12" w:color="6C8EBF"/>
+              <w:right w:val="single" w:sz="12" w:color="6C8EBF"/>
+            </w:tcBorders>
+            <w:vAlign w:val="center"/>
+          </w:tcPr>
+          <w:p>
+            <w:pPr>
+              <w:jc w:val="center"/>
+              <w:spacing w:after="40"/>
+            </w:pPr>
+            <w:r>
+              <w:rPr>
+                <w:b/>
+                <w:sz w:val="18"/>
+              </w:rPr>
+              <w:t xml:space="preserve">PostgreSQL</w:t>
+            </w:r>
+          </w:p>
+          <w:p>
+            <w:pPr>
+              <w:jc w:val="center"/>
+              <w:spacing w:after="0"/>
+            </w:pPr>
+            <w:r>
+              <w:rPr>
+                <w:sz w:val="15"/>
+              </w:rPr>
+              <w:t xml:space="preserve">Domain JSON builder functions create denormalized search document arrays.</w:t>
+            </w:r>
+          </w:p>
+        </w:tc>
+        <w:tc>
+          <w:tcPr>
+            <w:tcW w:w="300" w:type="dxa"/>
+            <w:vAlign w:val="center"/>
+          </w:tcPr>
+          <w:p>
+            <w:pPr>
+              <w:jc w:val="center"/>
+            </w:pPr>
+            <w:r>
+              <w:rPr>
+                <w:color w:val="2E74B5"/>
+                <w:sz w:val="24"/>
+              </w:rPr>
+              <w:t>▶</w:t>
+            </w:r>
+          </w:p>
+        </w:tc>
+        <w:tc>
+          <w:tcPr>
+            <w:tcW w:w="0" w:type="auto"/>
+            <w:shd w:val="clear" w:fill="FFE6CC"/>
+            <w:tcBorders>
+              <w:top w:val="single" w:sz="12" w:color="D79B00"/>
+              <w:left w:val="single" w:sz="12" w:color="D79B00"/>
+              <w:bottom w:val="single" w:sz="12" w:color="D79B00"/>
+              <w:right w:val="single" w:sz="12" w:color="D79B00"/>
+            </w:tcBorders>
+            <w:vAlign w:val="center"/>
+          </w:tcPr>
+          <w:p>
+            <w:pPr>
+              <w:jc w:val="center"/>
+              <w:spacing w:after="40"/>
+            </w:pPr>
+            <w:r>
+              <w:rPr>
+                <w:b/>
+                <w:sz w:val="18"/>
+              </w:rPr>
+              <w:t xml:space="preserve">open_search_json</w:t>
+            </w:r>
+          </w:p>
+          <w:p>
+            <w:pPr>
+              <w:jc w:val="center"/>
+              <w:spacing w:after="0"/>
+            </w:pPr>
+            <w:r>
+              <w:rPr>
+                <w:sz w:val="15"/>
+              </w:rPr>
+              <w:t xml:space="preserve">pushJsonData() stages JSON and sets read=false / processed=false.</w:t>
+            </w:r>
+          </w:p>
+        </w:tc>
+        <w:tc>
+          <w:tcPr>
+            <w:tcW w:w="300" w:type="dxa"/>
+            <w:vAlign w:val="center"/>
+          </w:tcPr>
+          <w:p>
+            <w:pPr>
+              <w:jc w:val="center"/>
+            </w:pPr>
+            <w:r>
+              <w:rPr>
+                <w:color w:val="2E74B5"/>
+                <w:sz w:val="24"/>
+              </w:rPr>
+              <w:t>▶</w:t>
+            </w:r>
+          </w:p>
+        </w:tc>
+        <w:tc>
+          <w:tcPr>
+            <w:tcW w:w="0" w:type="auto"/>
+            <w:shd w:val="clear" w:fill="E1D5E7"/>
+            <w:tcBorders>
+              <w:top w:val="single" w:sz="12" w:color="9673A6"/>
+              <w:left w:val="single" w:sz="12" w:color="9673A6"/>
+              <w:bottom w:val="single" w:sz="12" w:color="9673A6"/>
+              <w:right w:val="single" w:sz="12" w:color="9673A6"/>
+            </w:tcBorders>
+            <w:vAlign w:val="center"/>
+          </w:tcPr>
+          <w:p>
+            <w:pPr>
+              <w:jc w:val="center"/>
+              <w:spacing w:after="40"/>
+            </w:pPr>
+            <w:r>
+              <w:rPr>
+                <w:b/>
+                <w:sz w:val="18"/>
+              </w:rPr>
+              <w:t xml:space="preserve">RDS → SQS</w:t>
+            </w:r>
+          </w:p>
+          <w:p>
+            <w:pPr>
+              <w:jc w:val="center"/>
+              <w:spacing w:after="0"/>
+            </w:pPr>
+            <w:r>
+              <w:rPr>
+                <w:sz w:val="15"/>
+              </w:rPr>
+              <w:t xml:space="preserve">Scheduled Lambda selects unread rows and sends osj_id + index name to SearchQueue.fifo.</w:t>
+            </w:r>
+          </w:p>
+        </w:tc>
+        <w:tc>
+          <w:tcPr>
+            <w:tcW w:w="300" w:type="dxa"/>
+            <w:vAlign w:val="center"/>
+          </w:tcPr>
+          <w:p>
+            <w:pPr>
+              <w:jc w:val="center"/>
+            </w:pPr>
+            <w:r>
+              <w:rPr>
+                <w:color w:val="2E74B5"/>
+                <w:sz w:val="24"/>
+              </w:rPr>
+              <w:t>▶</w:t>
+            </w:r>
+          </w:p>
+        </w:tc>
+        <w:tc>
+          <w:tcPr>
+            <w:tcW w:w="0" w:type="auto"/>
+            <w:shd w:val="clear" w:fill="D5E8D4"/>
+            <w:tcBorders>
+              <w:top w:val="single" w:sz="12" w:color="82B366"/>
+              <w:left w:val="single" w:sz="12" w:color="82B366"/>
+              <w:bottom w:val="single" w:sz="12" w:color="82B366"/>
+              <w:right w:val="single" w:sz="12" w:color="82B366"/>
+            </w:tcBorders>
+            <w:vAlign w:val="center"/>
+          </w:tcPr>
+          <w:p>
+            <w:pPr>
+              <w:jc w:val="center"/>
+              <w:spacing w:after="40"/>
+            </w:pPr>
+            <w:r>
+              <w:rPr>
+                <w:b/>
+                <w:sz w:val="18"/>
+              </w:rPr>
+              <w:t xml:space="preserve">SQS → OpenSearch</w:t>
+            </w:r>
+          </w:p>
+          <w:p>
+            <w:pPr>
+              <w:jc w:val="center"/>
+              <w:spacing w:after="0"/>
+            </w:pPr>
+            <w:r>
+              <w:rPr>
+                <w:sz w:val="15"/>
+              </w:rPr>
+              <w:t xml:space="preserve">Consumer re-fetches JSON by osj_id, assigns stable IDs, bulk-indexes documents, then marks processed=true.</w:t>
+            </w:r>
+          </w:p>
+        </w:tc>
+        <w:tc>
+          <w:tcPr>
+            <w:tcW w:w="300" w:type="dxa"/>
+            <w:vAlign w:val="center"/>
+          </w:tcPr>
+          <w:p>
+            <w:pPr>
+              <w:jc w:val="center"/>
+            </w:pPr>
+            <w:r>
+              <w:rPr>
+                <w:color w:val="2E74B5"/>
+                <w:sz w:val="24"/>
+              </w:rPr>
+              <w:t>▶</w:t>
+            </w:r>
+          </w:p>
+        </w:tc>
+        <w:tc>
+          <w:tcPr>
+            <w:tcW w:w="0" w:type="auto"/>
+            <w:shd w:val="clear" w:fill="DAE8FC"/>
+            <w:tcBorders>
+              <w:top w:val="single" w:sz="12" w:color="6C8EBF"/>
+              <w:left w:val="single" w:sz="12" w:color="6C8EBF"/>
+              <w:bottom w:val="single" w:sz="12" w:color="6C8EBF"/>
+              <w:right w:val="single" w:sz="12" w:color="6C8EBF"/>
+            </w:tcBorders>
+            <w:vAlign w:val="center"/>
+          </w:tcPr>
+          <w:p>
+            <w:pPr>
+              <w:jc w:val="center"/>
+              <w:spacing w:after="40"/>
+            </w:pPr>
+            <w:r>
+              <w:rPr>
+                <w:b/>
+                <w:sz w:val="18"/>
+              </w:rPr>
+              <w:t xml:space="preserve">OpenSearch</w:t>
+            </w:r>
+          </w:p>
+          <w:p>
+            <w:pPr>
+              <w:jc w:val="center"/>
+              <w:spacing w:after="0"/>
+            </w:pPr>
+            <w:r>
+              <w:rPr>
+                <w:sz w:val="15"/>
+              </w:rPr>
+              <w:t xml:space="preserve">Current SPARKS keyword, pills and filter search continues to query the indexed documents.</w:t>
+            </w:r>
+          </w:p>
+        </w:tc>
+      </w:tr>
+    </w:tbl>
+    <w:p>
+      <w:pPr>
+        <w:numPr>
+          <w:ilvl w:val="0"/>
+          <w:numId w:val="1"/>
+        </w:numPr>
+      </w:pPr>
+      <w:r>
+        <w:t xml:space="preserve">SQS carries IDs, not the full JSON payload.</w:t>
+      </w:r>
+    </w:p>
+    <w:p>
+      <w:pPr>
+        <w:numPr>
+          <w:ilvl w:val="0"/>
+          <w:numId w:val="1"/>
+        </w:numPr>
+      </w:pPr>
+      <w:r>
+        <w:t xml:space="preserve">The existing Lambdas, queue, JSON builders, flags and indexes remain unchanged.</w:t>
+      </w:r>
+    </w:p>
+    <w:p>
+      <w:r>
+        <w:t/>
+      </w:r>
+    </w:p>
+    <w:p>
       <w:pPr>
         <w:pStyle w:val="Heading3"/>
       </w:pPr>
@@ -1051,6 +1385,340 @@
       </w:r>
     </w:p>
     <w:p>
+      <w:r>
+        <w:rPr>
+          <w:b/>
+        </w:rPr>
+        <w:t xml:space="preserve">Option 1 flow</w:t>
+      </w:r>
+      <w:r>
+        <w:t xml:space="preserve"> — *separate AI retrieval path; current OpenSearch indexing remains untouched:*</w:t>
+      </w:r>
+    </w:p>
+    <w:p>
+      <w:pPr>
+        <w:jc w:val="center"/>
+        <w:spacing w:before="120" w:after="80"/>
+      </w:pPr>
+      <w:r>
+        <w:rPr>
+          <w:b/>
+          <w:color w:val="1F3864"/>
+          <w:sz w:val="24"/>
+        </w:rPr>
+        <w:t xml:space="preserve">Option 1 — Generative AI / RAG Search</w:t>
+      </w:r>
+    </w:p>
+    <w:tbl>
+      <w:tblPr>
+        <w:tblW w:w="5000" w:type="pct"/>
+        <w:tblLayout w:type="fixed"/>
+        <w:jc w:val="center"/>
+      </w:tblPr>
+      <w:tblGrid>
+        <w:gridCol/>
+        <w:gridCol/>
+        <w:gridCol/>
+        <w:gridCol/>
+        <w:gridCol/>
+        <w:gridCol/>
+        <w:gridCol/>
+        <w:gridCol/>
+        <w:gridCol/>
+      </w:tblGrid>
+      <w:tr>
+        <w:tc>
+          <w:tcPr>
+            <w:tcW w:w="0" w:type="auto"/>
+            <w:shd w:val="clear" w:fill="DAE8FC"/>
+            <w:tcBorders>
+              <w:top w:val="single" w:sz="12" w:color="6C8EBF"/>
+              <w:left w:val="single" w:sz="12" w:color="6C8EBF"/>
+              <w:bottom w:val="single" w:sz="12" w:color="6C8EBF"/>
+              <w:right w:val="single" w:sz="12" w:color="6C8EBF"/>
+            </w:tcBorders>
+            <w:vAlign w:val="center"/>
+          </w:tcPr>
+          <w:p>
+            <w:pPr>
+              <w:jc w:val="center"/>
+              <w:spacing w:after="40"/>
+            </w:pPr>
+            <w:r>
+              <w:rPr>
+                <w:b/>
+                <w:sz w:val="18"/>
+              </w:rPr>
+              <w:t xml:space="preserve">SPARKS Data</w:t>
+            </w:r>
+          </w:p>
+          <w:p>
+            <w:pPr>
+              <w:jc w:val="center"/>
+              <w:spacing w:after="0"/>
+            </w:pPr>
+            <w:r>
+              <w:rPr>
+                <w:sz w:val="15"/>
+              </w:rPr>
+              <w:t xml:space="preserve">Read-only source. Reuse current domain JSON where sufficient; enrich or create AI-specific domain JSON for gaps.</w:t>
+            </w:r>
+          </w:p>
+        </w:tc>
+        <w:tc>
+          <w:tcPr>
+            <w:tcW w:w="300" w:type="dxa"/>
+            <w:vAlign w:val="center"/>
+          </w:tcPr>
+          <w:p>
+            <w:pPr>
+              <w:jc w:val="center"/>
+            </w:pPr>
+            <w:r>
+              <w:rPr>
+                <w:color w:val="2E74B5"/>
+                <w:sz w:val="24"/>
+              </w:rPr>
+              <w:t>▶</w:t>
+            </w:r>
+          </w:p>
+        </w:tc>
+        <w:tc>
+          <w:tcPr>
+            <w:tcW w:w="0" w:type="auto"/>
+            <w:shd w:val="clear" w:fill="FFE6CC"/>
+            <w:tcBorders>
+              <w:top w:val="single" w:sz="12" w:color="D79B00"/>
+              <w:left w:val="single" w:sz="12" w:color="D79B00"/>
+              <w:bottom w:val="single" w:sz="12" w:color="D79B00"/>
+              <w:right w:val="single" w:sz="12" w:color="D79B00"/>
+            </w:tcBorders>
+            <w:vAlign w:val="center"/>
+          </w:tcPr>
+          <w:p>
+            <w:pPr>
+              <w:jc w:val="center"/>
+              <w:spacing w:after="40"/>
+            </w:pPr>
+            <w:r>
+              <w:rPr>
+                <w:b/>
+                <w:sz w:val="18"/>
+              </w:rPr>
+              <w:t xml:space="preserve">AI Data Prep</w:t>
+            </w:r>
+          </w:p>
+          <w:p>
+            <w:pPr>
+              <w:jc w:val="center"/>
+              <w:spacing w:after="0"/>
+            </w:pPr>
+            <w:r>
+              <w:rPr>
+                <w:sz w:val="15"/>
+              </w:rPr>
+              <w:t xml:space="preserve">Normalize and curate approved investigation, vehicle, equipment, test and reference content. Preserve source record identifiers.</w:t>
+            </w:r>
+          </w:p>
+        </w:tc>
+        <w:tc>
+          <w:tcPr>
+            <w:tcW w:w="300" w:type="dxa"/>
+            <w:vAlign w:val="center"/>
+          </w:tcPr>
+          <w:p>
+            <w:pPr>
+              <w:jc w:val="center"/>
+            </w:pPr>
+            <w:r>
+              <w:rPr>
+                <w:color w:val="2E74B5"/>
+                <w:sz w:val="24"/>
+              </w:rPr>
+              <w:t>▶</w:t>
+            </w:r>
+          </w:p>
+        </w:tc>
+        <w:tc>
+          <w:tcPr>
+            <w:tcW w:w="0" w:type="auto"/>
+            <w:shd w:val="clear" w:fill="E1D5E7"/>
+            <w:tcBorders>
+              <w:top w:val="single" w:sz="12" w:color="9673A6"/>
+              <w:left w:val="single" w:sz="12" w:color="9673A6"/>
+              <w:bottom w:val="single" w:sz="12" w:color="9673A6"/>
+              <w:right w:val="single" w:sz="12" w:color="9673A6"/>
+            </w:tcBorders>
+            <w:vAlign w:val="center"/>
+          </w:tcPr>
+          <w:p>
+            <w:pPr>
+              <w:jc w:val="center"/>
+              <w:spacing w:after="40"/>
+            </w:pPr>
+            <w:r>
+              <w:rPr>
+                <w:b/>
+                <w:sz w:val="18"/>
+              </w:rPr>
+              <w:t xml:space="preserve">RAG Search Content</w:t>
+            </w:r>
+          </w:p>
+          <w:p>
+            <w:pPr>
+              <w:jc w:val="center"/>
+              <w:spacing w:after="0"/>
+            </w:pPr>
+            <w:r>
+              <w:rPr>
+                <w:sz w:val="15"/>
+              </w:rPr>
+              <w:t xml:space="preserve">Store curated content in an approved AI data layer and index embeddings in a vector store.</w:t>
+            </w:r>
+          </w:p>
+        </w:tc>
+        <w:tc>
+          <w:tcPr>
+            <w:tcW w:w="300" w:type="dxa"/>
+            <w:vAlign w:val="center"/>
+          </w:tcPr>
+          <w:p>
+            <w:pPr>
+              <w:jc w:val="center"/>
+            </w:pPr>
+            <w:r>
+              <w:rPr>
+                <w:color w:val="2E74B5"/>
+                <w:sz w:val="24"/>
+              </w:rPr>
+              <w:t>▶</w:t>
+            </w:r>
+          </w:p>
+        </w:tc>
+        <w:tc>
+          <w:tcPr>
+            <w:tcW w:w="0" w:type="auto"/>
+            <w:shd w:val="clear" w:fill="D5E8D4"/>
+            <w:tcBorders>
+              <w:top w:val="single" w:sz="12" w:color="82B366"/>
+              <w:left w:val="single" w:sz="12" w:color="82B366"/>
+              <w:bottom w:val="single" w:sz="12" w:color="82B366"/>
+              <w:right w:val="single" w:sz="12" w:color="82B366"/>
+            </w:tcBorders>
+            <w:vAlign w:val="center"/>
+          </w:tcPr>
+          <w:p>
+            <w:pPr>
+              <w:jc w:val="center"/>
+              <w:spacing w:after="40"/>
+            </w:pPr>
+            <w:r>
+              <w:rPr>
+                <w:b/>
+                <w:sz w:val="18"/>
+              </w:rPr>
+              <w:t xml:space="preserve">Bedrock + Claude</w:t>
+            </w:r>
+          </w:p>
+          <w:p>
+            <w:pPr>
+              <w:jc w:val="center"/>
+              <w:spacing w:after="0"/>
+            </w:pPr>
+            <w:r>
+              <w:rPr>
+                <w:sz w:val="15"/>
+              </w:rPr>
+              <w:t xml:space="preserve">Retrieve relevant chunks, apply metadata filters, and generate a grounded answer with source citations.</w:t>
+            </w:r>
+          </w:p>
+        </w:tc>
+        <w:tc>
+          <w:tcPr>
+            <w:tcW w:w="300" w:type="dxa"/>
+            <w:vAlign w:val="center"/>
+          </w:tcPr>
+          <w:p>
+            <w:pPr>
+              <w:jc w:val="center"/>
+            </w:pPr>
+            <w:r>
+              <w:rPr>
+                <w:color w:val="2E74B5"/>
+                <w:sz w:val="24"/>
+              </w:rPr>
+              <w:t>▶</w:t>
+            </w:r>
+          </w:p>
+        </w:tc>
+        <w:tc>
+          <w:tcPr>
+            <w:tcW w:w="0" w:type="auto"/>
+            <w:shd w:val="clear" w:fill="DAE8FC"/>
+            <w:tcBorders>
+              <w:top w:val="single" w:sz="12" w:color="6C8EBF"/>
+              <w:left w:val="single" w:sz="12" w:color="6C8EBF"/>
+              <w:bottom w:val="single" w:sz="12" w:color="6C8EBF"/>
+              <w:right w:val="single" w:sz="12" w:color="6C8EBF"/>
+            </w:tcBorders>
+            <w:vAlign w:val="center"/>
+          </w:tcPr>
+          <w:p>
+            <w:pPr>
+              <w:jc w:val="center"/>
+              <w:spacing w:after="40"/>
+            </w:pPr>
+            <w:r>
+              <w:rPr>
+                <w:b/>
+                <w:sz w:val="18"/>
+              </w:rPr>
+              <w:t xml:space="preserve">Ask SPARKS</w:t>
+            </w:r>
+          </w:p>
+          <w:p>
+            <w:pPr>
+              <w:jc w:val="center"/>
+              <w:spacing w:after="0"/>
+            </w:pPr>
+            <w:r>
+              <w:rPr>
+                <w:sz w:val="15"/>
+              </w:rPr>
+              <w:t xml:space="preserve">Natural-language questions, summaries, similar cases, citations and follow-up questions in the SPARKS UI.</w:t>
+            </w:r>
+          </w:p>
+        </w:tc>
+      </w:tr>
+    </w:tbl>
+    <w:p>
+      <w:pPr>
+        <w:numPr>
+          <w:ilvl w:val="0"/>
+          <w:numId w:val="1"/>
+        </w:numPr>
+      </w:pPr>
+      <w:r>
+        <w:t xml:space="preserve">No direct agent access to operational PostgreSQL is required.</w:t>
+      </w:r>
+    </w:p>
+    <w:p>
+      <w:pPr>
+        <w:numPr>
+          <w:ilvl w:val="0"/>
+          <w:numId w:val="1"/>
+        </w:numPr>
+      </w:pPr>
+      <w:r>
+        <w:t xml:space="preserve">Coverage can expand beyond today's search JSON by enriching the AI search content.</w:t>
+      </w:r>
+    </w:p>
+    <w:p>
+      <w:r>
+        <w:t/>
+      </w:r>
+    </w:p>
+    <w:p>
       <w:pPr>
         <w:pStyle w:val="Heading3"/>
       </w:pPr>
@@ -1513,6 +2181,340 @@
     <w:p>
       <w:r>
         <w:t xml:space="preserve">Option 2 adds an orchestration layer that can decide how to answer a question using a controlled set of SPARKS tools. It is appropriate when a single question may require several retrieval steps, exact filters, semantic similarity, record lookups, or multiple approved sources.</w:t>
+      </w:r>
+    </w:p>
+    <w:p>
+      <w:r>
+        <w:rPr>
+          <w:b/>
+        </w:rPr>
+        <w:t xml:space="preserve">Option 2 flow</w:t>
+      </w:r>
+      <w:r>
+        <w:t xml:space="preserve"> — *an orchestration layer chooses approved search tools for complex, multi-step questions:*</w:t>
+      </w:r>
+    </w:p>
+    <w:p>
+      <w:pPr>
+        <w:jc w:val="center"/>
+        <w:spacing w:before="120" w:after="80"/>
+      </w:pPr>
+      <w:r>
+        <w:rPr>
+          <w:b/>
+          <w:color w:val="1F3864"/>
+          <w:sz w:val="24"/>
+        </w:rPr>
+        <w:t xml:space="preserve">Option 2 — Agentic Hybrid Search</w:t>
+      </w:r>
+    </w:p>
+    <w:tbl>
+      <w:tblPr>
+        <w:tblW w:w="5000" w:type="pct"/>
+        <w:tblLayout w:type="fixed"/>
+        <w:jc w:val="center"/>
+      </w:tblPr>
+      <w:tblGrid>
+        <w:gridCol/>
+        <w:gridCol/>
+        <w:gridCol/>
+        <w:gridCol/>
+        <w:gridCol/>
+        <w:gridCol/>
+        <w:gridCol/>
+        <w:gridCol/>
+        <w:gridCol/>
+      </w:tblGrid>
+      <w:tr>
+        <w:tc>
+          <w:tcPr>
+            <w:tcW w:w="0" w:type="auto"/>
+            <w:shd w:val="clear" w:fill="DAE8FC"/>
+            <w:tcBorders>
+              <w:top w:val="single" w:sz="12" w:color="6C8EBF"/>
+              <w:left w:val="single" w:sz="12" w:color="6C8EBF"/>
+              <w:bottom w:val="single" w:sz="12" w:color="6C8EBF"/>
+              <w:right w:val="single" w:sz="12" w:color="6C8EBF"/>
+            </w:tcBorders>
+            <w:vAlign w:val="center"/>
+          </w:tcPr>
+          <w:p>
+            <w:pPr>
+              <w:jc w:val="center"/>
+              <w:spacing w:after="40"/>
+            </w:pPr>
+            <w:r>
+              <w:rPr>
+                <w:b/>
+                <w:sz w:val="18"/>
+              </w:rPr>
+              <w:t xml:space="preserve">Ask SPARKS</w:t>
+            </w:r>
+          </w:p>
+          <w:p>
+            <w:pPr>
+              <w:jc w:val="center"/>
+              <w:spacing w:after="0"/>
+            </w:pPr>
+            <w:r>
+              <w:rPr>
+                <w:sz w:val="15"/>
+              </w:rPr>
+              <w:t xml:space="preserve">User asks one natural-language question, including multi-part comparisons or follow-ups.</w:t>
+            </w:r>
+          </w:p>
+        </w:tc>
+        <w:tc>
+          <w:tcPr>
+            <w:tcW w:w="300" w:type="dxa"/>
+            <w:vAlign w:val="center"/>
+          </w:tcPr>
+          <w:p>
+            <w:pPr>
+              <w:jc w:val="center"/>
+            </w:pPr>
+            <w:r>
+              <w:rPr>
+                <w:color w:val="2E74B5"/>
+                <w:sz w:val="24"/>
+              </w:rPr>
+              <w:t>▶</w:t>
+            </w:r>
+          </w:p>
+        </w:tc>
+        <w:tc>
+          <w:tcPr>
+            <w:tcW w:w="0" w:type="auto"/>
+            <w:shd w:val="clear" w:fill="FFE6CC"/>
+            <w:tcBorders>
+              <w:top w:val="single" w:sz="12" w:color="D79B00"/>
+              <w:left w:val="single" w:sz="12" w:color="D79B00"/>
+              <w:bottom w:val="single" w:sz="12" w:color="D79B00"/>
+              <w:right w:val="single" w:sz="12" w:color="D79B00"/>
+            </w:tcBorders>
+            <w:vAlign w:val="center"/>
+          </w:tcPr>
+          <w:p>
+            <w:pPr>
+              <w:jc w:val="center"/>
+              <w:spacing w:after="40"/>
+            </w:pPr>
+            <w:r>
+              <w:rPr>
+                <w:b/>
+                <w:sz w:val="18"/>
+              </w:rPr>
+              <w:t xml:space="preserve">Agent Orchestrator</w:t>
+            </w:r>
+          </w:p>
+          <w:p>
+            <w:pPr>
+              <w:jc w:val="center"/>
+              <w:spacing w:after="0"/>
+            </w:pPr>
+            <w:r>
+              <w:rPr>
+                <w:sz w:val="15"/>
+              </w:rPr>
+              <w:t xml:space="preserve">Understand intent, plan steps, select approved tools, combine results and enforce guardrails.</w:t>
+            </w:r>
+          </w:p>
+        </w:tc>
+        <w:tc>
+          <w:tcPr>
+            <w:tcW w:w="300" w:type="dxa"/>
+            <w:vAlign w:val="center"/>
+          </w:tcPr>
+          <w:p>
+            <w:pPr>
+              <w:jc w:val="center"/>
+            </w:pPr>
+            <w:r>
+              <w:rPr>
+                <w:color w:val="2E74B5"/>
+                <w:sz w:val="24"/>
+              </w:rPr>
+              <w:t>▶</w:t>
+            </w:r>
+          </w:p>
+        </w:tc>
+        <w:tc>
+          <w:tcPr>
+            <w:tcW w:w="0" w:type="auto"/>
+            <w:shd w:val="clear" w:fill="E1D5E7"/>
+            <w:tcBorders>
+              <w:top w:val="single" w:sz="12" w:color="9673A6"/>
+              <w:left w:val="single" w:sz="12" w:color="9673A6"/>
+              <w:bottom w:val="single" w:sz="12" w:color="9673A6"/>
+              <w:right w:val="single" w:sz="12" w:color="9673A6"/>
+            </w:tcBorders>
+            <w:vAlign w:val="center"/>
+          </w:tcPr>
+          <w:p>
+            <w:pPr>
+              <w:jc w:val="center"/>
+              <w:spacing w:after="40"/>
+            </w:pPr>
+            <w:r>
+              <w:rPr>
+                <w:b/>
+                <w:sz w:val="18"/>
+              </w:rPr>
+              <w:t xml:space="preserve">Approved Tools</w:t>
+            </w:r>
+          </w:p>
+          <w:p>
+            <w:pPr>
+              <w:jc w:val="center"/>
+              <w:spacing w:after="0"/>
+            </w:pPr>
+            <w:r>
+              <w:rPr>
+                <w:sz w:val="15"/>
+              </w:rPr>
+              <w:t xml:space="preserve">Existing OpenSearch exact/filter search + semantic/vector retrieval + read-only record/detail APIs.</w:t>
+            </w:r>
+          </w:p>
+        </w:tc>
+        <w:tc>
+          <w:tcPr>
+            <w:tcW w:w="300" w:type="dxa"/>
+            <w:vAlign w:val="center"/>
+          </w:tcPr>
+          <w:p>
+            <w:pPr>
+              <w:jc w:val="center"/>
+            </w:pPr>
+            <w:r>
+              <w:rPr>
+                <w:color w:val="2E74B5"/>
+                <w:sz w:val="24"/>
+              </w:rPr>
+              <w:t>▶</w:t>
+            </w:r>
+          </w:p>
+        </w:tc>
+        <w:tc>
+          <w:tcPr>
+            <w:tcW w:w="0" w:type="auto"/>
+            <w:shd w:val="clear" w:fill="D5E8D4"/>
+            <w:tcBorders>
+              <w:top w:val="single" w:sz="12" w:color="82B366"/>
+              <w:left w:val="single" w:sz="12" w:color="82B366"/>
+              <w:bottom w:val="single" w:sz="12" w:color="82B366"/>
+              <w:right w:val="single" w:sz="12" w:color="82B366"/>
+            </w:tcBorders>
+            <w:vAlign w:val="center"/>
+          </w:tcPr>
+          <w:p>
+            <w:pPr>
+              <w:jc w:val="center"/>
+              <w:spacing w:after="40"/>
+            </w:pPr>
+            <w:r>
+              <w:rPr>
+                <w:b/>
+                <w:sz w:val="18"/>
+              </w:rPr>
+              <w:t xml:space="preserve">Claude</w:t>
+            </w:r>
+          </w:p>
+          <w:p>
+            <w:pPr>
+              <w:jc w:val="center"/>
+              <w:spacing w:after="0"/>
+            </w:pPr>
+            <w:r>
+              <w:rPr>
+                <w:sz w:val="15"/>
+              </w:rPr>
+              <w:t xml:space="preserve">Synthesize results, reason across retrieved records, and generate a grounded response.</w:t>
+            </w:r>
+          </w:p>
+        </w:tc>
+        <w:tc>
+          <w:tcPr>
+            <w:tcW w:w="300" w:type="dxa"/>
+            <w:vAlign w:val="center"/>
+          </w:tcPr>
+          <w:p>
+            <w:pPr>
+              <w:jc w:val="center"/>
+            </w:pPr>
+            <w:r>
+              <w:rPr>
+                <w:color w:val="2E74B5"/>
+                <w:sz w:val="24"/>
+              </w:rPr>
+              <w:t>▶</w:t>
+            </w:r>
+          </w:p>
+        </w:tc>
+        <w:tc>
+          <w:tcPr>
+            <w:tcW w:w="0" w:type="auto"/>
+            <w:shd w:val="clear" w:fill="DAE8FC"/>
+            <w:tcBorders>
+              <w:top w:val="single" w:sz="12" w:color="6C8EBF"/>
+              <w:left w:val="single" w:sz="12" w:color="6C8EBF"/>
+              <w:bottom w:val="single" w:sz="12" w:color="6C8EBF"/>
+              <w:right w:val="single" w:sz="12" w:color="6C8EBF"/>
+            </w:tcBorders>
+            <w:vAlign w:val="center"/>
+          </w:tcPr>
+          <w:p>
+            <w:pPr>
+              <w:jc w:val="center"/>
+              <w:spacing w:after="40"/>
+            </w:pPr>
+            <w:r>
+              <w:rPr>
+                <w:b/>
+                <w:sz w:val="18"/>
+              </w:rPr>
+              <w:t xml:space="preserve">Response</w:t>
+            </w:r>
+          </w:p>
+          <w:p>
+            <w:pPr>
+              <w:jc w:val="center"/>
+              <w:spacing w:after="0"/>
+            </w:pPr>
+            <w:r>
+              <w:rPr>
+                <w:sz w:val="15"/>
+              </w:rPr>
+              <w:t xml:space="preserve">Answer + structured results + source links/citations + follow-up questions.</w:t>
+            </w:r>
+          </w:p>
+        </w:tc>
+      </w:tr>
+    </w:tbl>
+    <w:p>
+      <w:pPr>
+        <w:numPr>
+          <w:ilvl w:val="0"/>
+          <w:numId w:val="1"/>
+        </w:numPr>
+      </w:pPr>
+      <w:r>
+        <w:t xml:space="preserve">No unrestricted SQL tool.</w:t>
+      </w:r>
+    </w:p>
+    <w:p>
+      <w:pPr>
+        <w:numPr>
+          <w:ilvl w:val="0"/>
+          <w:numId w:val="1"/>
+        </w:numPr>
+      </w:pPr>
+      <w:r>
+        <w:t xml:space="preserve">Existing OpenSearch becomes one tool; RAG/vector retrieval becomes another.</w:t>
+      </w:r>
+    </w:p>
+    <w:p>
+      <w:r>
+        <w:t/>
       </w:r>
     </w:p>
     <w:p>

</xml_diff>

<commit_message>
Add the three 5-box flow diagrams to the refined proposal (#9)
- Current OpenSearch Indexing Flow (As-Is), Option 1 (RAG) flow, Option 2 (Agentic) flow
- Rendered three ways: styled colored boxes in .docx (horizontal flow tables) and .html,
  plus Mermaid flowcharts that render natively on GitHub
- Flow source kept in PROPOSAL.md as a ::flow:: block wrapped in an HTML comment so GitHub
  shows only the Mermaid diagram; build_docx.py / build_html.py unwrap + render it
- All existing tables retained; docx valid Microsoft Word 2007+; no syntax leaked

Co-authored-by: Kiro Agent <agent@kiro.dev>
</commit_message>
<xml_diff>
--- a/sparks-ai-search/SPARKS_AI_Search_Proposal.docx
+++ b/sparks-ai-search/SPARKS_AI_Search_Proposal.docx
@@ -330,6 +330,340 @@
       </w:r>
     </w:p>
     <w:p>
+      <w:r>
+        <w:rPr>
+          <w:b/>
+        </w:rPr>
+        <w:t xml:space="preserve">SPARKS Current OpenSearch Indexing Flow</w:t>
+      </w:r>
+      <w:r>
+        <w:t xml:space="preserve"> — *existing production pattern, unchanged by the AI proposal:*</w:t>
+      </w:r>
+    </w:p>
+    <w:p>
+      <w:pPr>
+        <w:jc w:val="center"/>
+        <w:spacing w:before="120" w:after="80"/>
+      </w:pPr>
+      <w:r>
+        <w:rPr>
+          <w:b/>
+          <w:color w:val="1F3864"/>
+          <w:sz w:val="24"/>
+        </w:rPr>
+        <w:t xml:space="preserve">Current OpenSearch Indexing Flow</w:t>
+      </w:r>
+    </w:p>
+    <w:tbl>
+      <w:tblPr>
+        <w:tblW w:w="5000" w:type="pct"/>
+        <w:tblLayout w:type="fixed"/>
+        <w:jc w:val="center"/>
+      </w:tblPr>
+      <w:tblGrid>
+        <w:gridCol/>
+        <w:gridCol/>
+        <w:gridCol/>
+        <w:gridCol/>
+        <w:gridCol/>
+        <w:gridCol/>
+        <w:gridCol/>
+        <w:gridCol/>
+        <w:gridCol/>
+      </w:tblGrid>
+      <w:tr>
+        <w:tc>
+          <w:tcPr>
+            <w:tcW w:w="0" w:type="auto"/>
+            <w:shd w:val="clear" w:fill="DAE8FC"/>
+            <w:tcBorders>
+              <w:top w:val="single" w:sz="12" w:color="6C8EBF"/>
+              <w:left w:val="single" w:sz="12" w:color="6C8EBF"/>
+              <w:bottom w:val="single" w:sz="12" w:color="6C8EBF"/>
+              <w:right w:val="single" w:sz="12" w:color="6C8EBF"/>
+            </w:tcBorders>
+            <w:vAlign w:val="center"/>
+          </w:tcPr>
+          <w:p>
+            <w:pPr>
+              <w:jc w:val="center"/>
+              <w:spacing w:after="40"/>
+            </w:pPr>
+            <w:r>
+              <w:rPr>
+                <w:b/>
+                <w:sz w:val="18"/>
+              </w:rPr>
+              <w:t xml:space="preserve">PostgreSQL</w:t>
+            </w:r>
+          </w:p>
+          <w:p>
+            <w:pPr>
+              <w:jc w:val="center"/>
+              <w:spacing w:after="0"/>
+            </w:pPr>
+            <w:r>
+              <w:rPr>
+                <w:sz w:val="15"/>
+              </w:rPr>
+              <w:t xml:space="preserve">Domain JSON builder functions create denormalized search document arrays.</w:t>
+            </w:r>
+          </w:p>
+        </w:tc>
+        <w:tc>
+          <w:tcPr>
+            <w:tcW w:w="300" w:type="dxa"/>
+            <w:vAlign w:val="center"/>
+          </w:tcPr>
+          <w:p>
+            <w:pPr>
+              <w:jc w:val="center"/>
+            </w:pPr>
+            <w:r>
+              <w:rPr>
+                <w:color w:val="2E74B5"/>
+                <w:sz w:val="24"/>
+              </w:rPr>
+              <w:t>▶</w:t>
+            </w:r>
+          </w:p>
+        </w:tc>
+        <w:tc>
+          <w:tcPr>
+            <w:tcW w:w="0" w:type="auto"/>
+            <w:shd w:val="clear" w:fill="FFE6CC"/>
+            <w:tcBorders>
+              <w:top w:val="single" w:sz="12" w:color="D79B00"/>
+              <w:left w:val="single" w:sz="12" w:color="D79B00"/>
+              <w:bottom w:val="single" w:sz="12" w:color="D79B00"/>
+              <w:right w:val="single" w:sz="12" w:color="D79B00"/>
+            </w:tcBorders>
+            <w:vAlign w:val="center"/>
+          </w:tcPr>
+          <w:p>
+            <w:pPr>
+              <w:jc w:val="center"/>
+              <w:spacing w:after="40"/>
+            </w:pPr>
+            <w:r>
+              <w:rPr>
+                <w:b/>
+                <w:sz w:val="18"/>
+              </w:rPr>
+              <w:t xml:space="preserve">open_search_json</w:t>
+            </w:r>
+          </w:p>
+          <w:p>
+            <w:pPr>
+              <w:jc w:val="center"/>
+              <w:spacing w:after="0"/>
+            </w:pPr>
+            <w:r>
+              <w:rPr>
+                <w:sz w:val="15"/>
+              </w:rPr>
+              <w:t xml:space="preserve">pushJsonData() stages JSON and sets read=false / processed=false.</w:t>
+            </w:r>
+          </w:p>
+        </w:tc>
+        <w:tc>
+          <w:tcPr>
+            <w:tcW w:w="300" w:type="dxa"/>
+            <w:vAlign w:val="center"/>
+          </w:tcPr>
+          <w:p>
+            <w:pPr>
+              <w:jc w:val="center"/>
+            </w:pPr>
+            <w:r>
+              <w:rPr>
+                <w:color w:val="2E74B5"/>
+                <w:sz w:val="24"/>
+              </w:rPr>
+              <w:t>▶</w:t>
+            </w:r>
+          </w:p>
+        </w:tc>
+        <w:tc>
+          <w:tcPr>
+            <w:tcW w:w="0" w:type="auto"/>
+            <w:shd w:val="clear" w:fill="E1D5E7"/>
+            <w:tcBorders>
+              <w:top w:val="single" w:sz="12" w:color="9673A6"/>
+              <w:left w:val="single" w:sz="12" w:color="9673A6"/>
+              <w:bottom w:val="single" w:sz="12" w:color="9673A6"/>
+              <w:right w:val="single" w:sz="12" w:color="9673A6"/>
+            </w:tcBorders>
+            <w:vAlign w:val="center"/>
+          </w:tcPr>
+          <w:p>
+            <w:pPr>
+              <w:jc w:val="center"/>
+              <w:spacing w:after="40"/>
+            </w:pPr>
+            <w:r>
+              <w:rPr>
+                <w:b/>
+                <w:sz w:val="18"/>
+              </w:rPr>
+              <w:t xml:space="preserve">RDS → SQS</w:t>
+            </w:r>
+          </w:p>
+          <w:p>
+            <w:pPr>
+              <w:jc w:val="center"/>
+              <w:spacing w:after="0"/>
+            </w:pPr>
+            <w:r>
+              <w:rPr>
+                <w:sz w:val="15"/>
+              </w:rPr>
+              <w:t xml:space="preserve">Scheduled Lambda selects unread rows and sends osj_id + index name to SearchQueue.fifo.</w:t>
+            </w:r>
+          </w:p>
+        </w:tc>
+        <w:tc>
+          <w:tcPr>
+            <w:tcW w:w="300" w:type="dxa"/>
+            <w:vAlign w:val="center"/>
+          </w:tcPr>
+          <w:p>
+            <w:pPr>
+              <w:jc w:val="center"/>
+            </w:pPr>
+            <w:r>
+              <w:rPr>
+                <w:color w:val="2E74B5"/>
+                <w:sz w:val="24"/>
+              </w:rPr>
+              <w:t>▶</w:t>
+            </w:r>
+          </w:p>
+        </w:tc>
+        <w:tc>
+          <w:tcPr>
+            <w:tcW w:w="0" w:type="auto"/>
+            <w:shd w:val="clear" w:fill="D5E8D4"/>
+            <w:tcBorders>
+              <w:top w:val="single" w:sz="12" w:color="82B366"/>
+              <w:left w:val="single" w:sz="12" w:color="82B366"/>
+              <w:bottom w:val="single" w:sz="12" w:color="82B366"/>
+              <w:right w:val="single" w:sz="12" w:color="82B366"/>
+            </w:tcBorders>
+            <w:vAlign w:val="center"/>
+          </w:tcPr>
+          <w:p>
+            <w:pPr>
+              <w:jc w:val="center"/>
+              <w:spacing w:after="40"/>
+            </w:pPr>
+            <w:r>
+              <w:rPr>
+                <w:b/>
+                <w:sz w:val="18"/>
+              </w:rPr>
+              <w:t xml:space="preserve">SQS → OpenSearch</w:t>
+            </w:r>
+          </w:p>
+          <w:p>
+            <w:pPr>
+              <w:jc w:val="center"/>
+              <w:spacing w:after="0"/>
+            </w:pPr>
+            <w:r>
+              <w:rPr>
+                <w:sz w:val="15"/>
+              </w:rPr>
+              <w:t xml:space="preserve">Consumer re-fetches JSON by osj_id, assigns stable IDs, bulk-indexes documents, then marks processed=true.</w:t>
+            </w:r>
+          </w:p>
+        </w:tc>
+        <w:tc>
+          <w:tcPr>
+            <w:tcW w:w="300" w:type="dxa"/>
+            <w:vAlign w:val="center"/>
+          </w:tcPr>
+          <w:p>
+            <w:pPr>
+              <w:jc w:val="center"/>
+            </w:pPr>
+            <w:r>
+              <w:rPr>
+                <w:color w:val="2E74B5"/>
+                <w:sz w:val="24"/>
+              </w:rPr>
+              <w:t>▶</w:t>
+            </w:r>
+          </w:p>
+        </w:tc>
+        <w:tc>
+          <w:tcPr>
+            <w:tcW w:w="0" w:type="auto"/>
+            <w:shd w:val="clear" w:fill="DAE8FC"/>
+            <w:tcBorders>
+              <w:top w:val="single" w:sz="12" w:color="6C8EBF"/>
+              <w:left w:val="single" w:sz="12" w:color="6C8EBF"/>
+              <w:bottom w:val="single" w:sz="12" w:color="6C8EBF"/>
+              <w:right w:val="single" w:sz="12" w:color="6C8EBF"/>
+            </w:tcBorders>
+            <w:vAlign w:val="center"/>
+          </w:tcPr>
+          <w:p>
+            <w:pPr>
+              <w:jc w:val="center"/>
+              <w:spacing w:after="40"/>
+            </w:pPr>
+            <w:r>
+              <w:rPr>
+                <w:b/>
+                <w:sz w:val="18"/>
+              </w:rPr>
+              <w:t xml:space="preserve">OpenSearch</w:t>
+            </w:r>
+          </w:p>
+          <w:p>
+            <w:pPr>
+              <w:jc w:val="center"/>
+              <w:spacing w:after="0"/>
+            </w:pPr>
+            <w:r>
+              <w:rPr>
+                <w:sz w:val="15"/>
+              </w:rPr>
+              <w:t xml:space="preserve">Current SPARKS keyword, pills and filter search continues to query the indexed documents.</w:t>
+            </w:r>
+          </w:p>
+        </w:tc>
+      </w:tr>
+    </w:tbl>
+    <w:p>
+      <w:pPr>
+        <w:numPr>
+          <w:ilvl w:val="0"/>
+          <w:numId w:val="1"/>
+        </w:numPr>
+      </w:pPr>
+      <w:r>
+        <w:t xml:space="preserve">SQS carries IDs, not the full JSON payload.</w:t>
+      </w:r>
+    </w:p>
+    <w:p>
+      <w:pPr>
+        <w:numPr>
+          <w:ilvl w:val="0"/>
+          <w:numId w:val="1"/>
+        </w:numPr>
+      </w:pPr>
+      <w:r>
+        <w:t xml:space="preserve">The existing Lambdas, queue, JSON builders, flags and indexes remain unchanged.</w:t>
+      </w:r>
+    </w:p>
+    <w:p>
+      <w:r>
+        <w:t/>
+      </w:r>
+    </w:p>
+    <w:p>
       <w:pPr>
         <w:pStyle w:val="Heading3"/>
       </w:pPr>
@@ -1051,6 +1385,340 @@
       </w:r>
     </w:p>
     <w:p>
+      <w:r>
+        <w:rPr>
+          <w:b/>
+        </w:rPr>
+        <w:t xml:space="preserve">Option 1 flow</w:t>
+      </w:r>
+      <w:r>
+        <w:t xml:space="preserve"> — *separate AI retrieval path; current OpenSearch indexing remains untouched:*</w:t>
+      </w:r>
+    </w:p>
+    <w:p>
+      <w:pPr>
+        <w:jc w:val="center"/>
+        <w:spacing w:before="120" w:after="80"/>
+      </w:pPr>
+      <w:r>
+        <w:rPr>
+          <w:b/>
+          <w:color w:val="1F3864"/>
+          <w:sz w:val="24"/>
+        </w:rPr>
+        <w:t xml:space="preserve">Option 1 — Generative AI / RAG Search</w:t>
+      </w:r>
+    </w:p>
+    <w:tbl>
+      <w:tblPr>
+        <w:tblW w:w="5000" w:type="pct"/>
+        <w:tblLayout w:type="fixed"/>
+        <w:jc w:val="center"/>
+      </w:tblPr>
+      <w:tblGrid>
+        <w:gridCol/>
+        <w:gridCol/>
+        <w:gridCol/>
+        <w:gridCol/>
+        <w:gridCol/>
+        <w:gridCol/>
+        <w:gridCol/>
+        <w:gridCol/>
+        <w:gridCol/>
+      </w:tblGrid>
+      <w:tr>
+        <w:tc>
+          <w:tcPr>
+            <w:tcW w:w="0" w:type="auto"/>
+            <w:shd w:val="clear" w:fill="DAE8FC"/>
+            <w:tcBorders>
+              <w:top w:val="single" w:sz="12" w:color="6C8EBF"/>
+              <w:left w:val="single" w:sz="12" w:color="6C8EBF"/>
+              <w:bottom w:val="single" w:sz="12" w:color="6C8EBF"/>
+              <w:right w:val="single" w:sz="12" w:color="6C8EBF"/>
+            </w:tcBorders>
+            <w:vAlign w:val="center"/>
+          </w:tcPr>
+          <w:p>
+            <w:pPr>
+              <w:jc w:val="center"/>
+              <w:spacing w:after="40"/>
+            </w:pPr>
+            <w:r>
+              <w:rPr>
+                <w:b/>
+                <w:sz w:val="18"/>
+              </w:rPr>
+              <w:t xml:space="preserve">SPARKS Data</w:t>
+            </w:r>
+          </w:p>
+          <w:p>
+            <w:pPr>
+              <w:jc w:val="center"/>
+              <w:spacing w:after="0"/>
+            </w:pPr>
+            <w:r>
+              <w:rPr>
+                <w:sz w:val="15"/>
+              </w:rPr>
+              <w:t xml:space="preserve">Read-only source. Reuse current domain JSON where sufficient; enrich or create AI-specific domain JSON for gaps.</w:t>
+            </w:r>
+          </w:p>
+        </w:tc>
+        <w:tc>
+          <w:tcPr>
+            <w:tcW w:w="300" w:type="dxa"/>
+            <w:vAlign w:val="center"/>
+          </w:tcPr>
+          <w:p>
+            <w:pPr>
+              <w:jc w:val="center"/>
+            </w:pPr>
+            <w:r>
+              <w:rPr>
+                <w:color w:val="2E74B5"/>
+                <w:sz w:val="24"/>
+              </w:rPr>
+              <w:t>▶</w:t>
+            </w:r>
+          </w:p>
+        </w:tc>
+        <w:tc>
+          <w:tcPr>
+            <w:tcW w:w="0" w:type="auto"/>
+            <w:shd w:val="clear" w:fill="FFE6CC"/>
+            <w:tcBorders>
+              <w:top w:val="single" w:sz="12" w:color="D79B00"/>
+              <w:left w:val="single" w:sz="12" w:color="D79B00"/>
+              <w:bottom w:val="single" w:sz="12" w:color="D79B00"/>
+              <w:right w:val="single" w:sz="12" w:color="D79B00"/>
+            </w:tcBorders>
+            <w:vAlign w:val="center"/>
+          </w:tcPr>
+          <w:p>
+            <w:pPr>
+              <w:jc w:val="center"/>
+              <w:spacing w:after="40"/>
+            </w:pPr>
+            <w:r>
+              <w:rPr>
+                <w:b/>
+                <w:sz w:val="18"/>
+              </w:rPr>
+              <w:t xml:space="preserve">AI Data Prep</w:t>
+            </w:r>
+          </w:p>
+          <w:p>
+            <w:pPr>
+              <w:jc w:val="center"/>
+              <w:spacing w:after="0"/>
+            </w:pPr>
+            <w:r>
+              <w:rPr>
+                <w:sz w:val="15"/>
+              </w:rPr>
+              <w:t xml:space="preserve">Normalize and curate approved investigation, vehicle, equipment, test and reference content. Preserve source record identifiers.</w:t>
+            </w:r>
+          </w:p>
+        </w:tc>
+        <w:tc>
+          <w:tcPr>
+            <w:tcW w:w="300" w:type="dxa"/>
+            <w:vAlign w:val="center"/>
+          </w:tcPr>
+          <w:p>
+            <w:pPr>
+              <w:jc w:val="center"/>
+            </w:pPr>
+            <w:r>
+              <w:rPr>
+                <w:color w:val="2E74B5"/>
+                <w:sz w:val="24"/>
+              </w:rPr>
+              <w:t>▶</w:t>
+            </w:r>
+          </w:p>
+        </w:tc>
+        <w:tc>
+          <w:tcPr>
+            <w:tcW w:w="0" w:type="auto"/>
+            <w:shd w:val="clear" w:fill="E1D5E7"/>
+            <w:tcBorders>
+              <w:top w:val="single" w:sz="12" w:color="9673A6"/>
+              <w:left w:val="single" w:sz="12" w:color="9673A6"/>
+              <w:bottom w:val="single" w:sz="12" w:color="9673A6"/>
+              <w:right w:val="single" w:sz="12" w:color="9673A6"/>
+            </w:tcBorders>
+            <w:vAlign w:val="center"/>
+          </w:tcPr>
+          <w:p>
+            <w:pPr>
+              <w:jc w:val="center"/>
+              <w:spacing w:after="40"/>
+            </w:pPr>
+            <w:r>
+              <w:rPr>
+                <w:b/>
+                <w:sz w:val="18"/>
+              </w:rPr>
+              <w:t xml:space="preserve">RAG Search Content</w:t>
+            </w:r>
+          </w:p>
+          <w:p>
+            <w:pPr>
+              <w:jc w:val="center"/>
+              <w:spacing w:after="0"/>
+            </w:pPr>
+            <w:r>
+              <w:rPr>
+                <w:sz w:val="15"/>
+              </w:rPr>
+              <w:t xml:space="preserve">Store curated content in an approved AI data layer and index embeddings in a vector store.</w:t>
+            </w:r>
+          </w:p>
+        </w:tc>
+        <w:tc>
+          <w:tcPr>
+            <w:tcW w:w="300" w:type="dxa"/>
+            <w:vAlign w:val="center"/>
+          </w:tcPr>
+          <w:p>
+            <w:pPr>
+              <w:jc w:val="center"/>
+            </w:pPr>
+            <w:r>
+              <w:rPr>
+                <w:color w:val="2E74B5"/>
+                <w:sz w:val="24"/>
+              </w:rPr>
+              <w:t>▶</w:t>
+            </w:r>
+          </w:p>
+        </w:tc>
+        <w:tc>
+          <w:tcPr>
+            <w:tcW w:w="0" w:type="auto"/>
+            <w:shd w:val="clear" w:fill="D5E8D4"/>
+            <w:tcBorders>
+              <w:top w:val="single" w:sz="12" w:color="82B366"/>
+              <w:left w:val="single" w:sz="12" w:color="82B366"/>
+              <w:bottom w:val="single" w:sz="12" w:color="82B366"/>
+              <w:right w:val="single" w:sz="12" w:color="82B366"/>
+            </w:tcBorders>
+            <w:vAlign w:val="center"/>
+          </w:tcPr>
+          <w:p>
+            <w:pPr>
+              <w:jc w:val="center"/>
+              <w:spacing w:after="40"/>
+            </w:pPr>
+            <w:r>
+              <w:rPr>
+                <w:b/>
+                <w:sz w:val="18"/>
+              </w:rPr>
+              <w:t xml:space="preserve">Bedrock + Claude</w:t>
+            </w:r>
+          </w:p>
+          <w:p>
+            <w:pPr>
+              <w:jc w:val="center"/>
+              <w:spacing w:after="0"/>
+            </w:pPr>
+            <w:r>
+              <w:rPr>
+                <w:sz w:val="15"/>
+              </w:rPr>
+              <w:t xml:space="preserve">Retrieve relevant chunks, apply metadata filters, and generate a grounded answer with source citations.</w:t>
+            </w:r>
+          </w:p>
+        </w:tc>
+        <w:tc>
+          <w:tcPr>
+            <w:tcW w:w="300" w:type="dxa"/>
+            <w:vAlign w:val="center"/>
+          </w:tcPr>
+          <w:p>
+            <w:pPr>
+              <w:jc w:val="center"/>
+            </w:pPr>
+            <w:r>
+              <w:rPr>
+                <w:color w:val="2E74B5"/>
+                <w:sz w:val="24"/>
+              </w:rPr>
+              <w:t>▶</w:t>
+            </w:r>
+          </w:p>
+        </w:tc>
+        <w:tc>
+          <w:tcPr>
+            <w:tcW w:w="0" w:type="auto"/>
+            <w:shd w:val="clear" w:fill="DAE8FC"/>
+            <w:tcBorders>
+              <w:top w:val="single" w:sz="12" w:color="6C8EBF"/>
+              <w:left w:val="single" w:sz="12" w:color="6C8EBF"/>
+              <w:bottom w:val="single" w:sz="12" w:color="6C8EBF"/>
+              <w:right w:val="single" w:sz="12" w:color="6C8EBF"/>
+            </w:tcBorders>
+            <w:vAlign w:val="center"/>
+          </w:tcPr>
+          <w:p>
+            <w:pPr>
+              <w:jc w:val="center"/>
+              <w:spacing w:after="40"/>
+            </w:pPr>
+            <w:r>
+              <w:rPr>
+                <w:b/>
+                <w:sz w:val="18"/>
+              </w:rPr>
+              <w:t xml:space="preserve">Ask SPARKS</w:t>
+            </w:r>
+          </w:p>
+          <w:p>
+            <w:pPr>
+              <w:jc w:val="center"/>
+              <w:spacing w:after="0"/>
+            </w:pPr>
+            <w:r>
+              <w:rPr>
+                <w:sz w:val="15"/>
+              </w:rPr>
+              <w:t xml:space="preserve">Natural-language questions, summaries, similar cases, citations and follow-up questions in the SPARKS UI.</w:t>
+            </w:r>
+          </w:p>
+        </w:tc>
+      </w:tr>
+    </w:tbl>
+    <w:p>
+      <w:pPr>
+        <w:numPr>
+          <w:ilvl w:val="0"/>
+          <w:numId w:val="1"/>
+        </w:numPr>
+      </w:pPr>
+      <w:r>
+        <w:t xml:space="preserve">No direct agent access to operational PostgreSQL is required.</w:t>
+      </w:r>
+    </w:p>
+    <w:p>
+      <w:pPr>
+        <w:numPr>
+          <w:ilvl w:val="0"/>
+          <w:numId w:val="1"/>
+        </w:numPr>
+      </w:pPr>
+      <w:r>
+        <w:t xml:space="preserve">Coverage can expand beyond today's search JSON by enriching the AI search content.</w:t>
+      </w:r>
+    </w:p>
+    <w:p>
+      <w:r>
+        <w:t/>
+      </w:r>
+    </w:p>
+    <w:p>
       <w:pPr>
         <w:pStyle w:val="Heading3"/>
       </w:pPr>
@@ -1513,6 +2181,340 @@
     <w:p>
       <w:r>
         <w:t xml:space="preserve">Option 2 adds an orchestration layer that can decide how to answer a question using a controlled set of SPARKS tools. It is appropriate when a single question may require several retrieval steps, exact filters, semantic similarity, record lookups, or multiple approved sources.</w:t>
+      </w:r>
+    </w:p>
+    <w:p>
+      <w:r>
+        <w:rPr>
+          <w:b/>
+        </w:rPr>
+        <w:t xml:space="preserve">Option 2 flow</w:t>
+      </w:r>
+      <w:r>
+        <w:t xml:space="preserve"> — *an orchestration layer chooses approved search tools for complex, multi-step questions:*</w:t>
+      </w:r>
+    </w:p>
+    <w:p>
+      <w:pPr>
+        <w:jc w:val="center"/>
+        <w:spacing w:before="120" w:after="80"/>
+      </w:pPr>
+      <w:r>
+        <w:rPr>
+          <w:b/>
+          <w:color w:val="1F3864"/>
+          <w:sz w:val="24"/>
+        </w:rPr>
+        <w:t xml:space="preserve">Option 2 — Agentic Hybrid Search</w:t>
+      </w:r>
+    </w:p>
+    <w:tbl>
+      <w:tblPr>
+        <w:tblW w:w="5000" w:type="pct"/>
+        <w:tblLayout w:type="fixed"/>
+        <w:jc w:val="center"/>
+      </w:tblPr>
+      <w:tblGrid>
+        <w:gridCol/>
+        <w:gridCol/>
+        <w:gridCol/>
+        <w:gridCol/>
+        <w:gridCol/>
+        <w:gridCol/>
+        <w:gridCol/>
+        <w:gridCol/>
+        <w:gridCol/>
+      </w:tblGrid>
+      <w:tr>
+        <w:tc>
+          <w:tcPr>
+            <w:tcW w:w="0" w:type="auto"/>
+            <w:shd w:val="clear" w:fill="DAE8FC"/>
+            <w:tcBorders>
+              <w:top w:val="single" w:sz="12" w:color="6C8EBF"/>
+              <w:left w:val="single" w:sz="12" w:color="6C8EBF"/>
+              <w:bottom w:val="single" w:sz="12" w:color="6C8EBF"/>
+              <w:right w:val="single" w:sz="12" w:color="6C8EBF"/>
+            </w:tcBorders>
+            <w:vAlign w:val="center"/>
+          </w:tcPr>
+          <w:p>
+            <w:pPr>
+              <w:jc w:val="center"/>
+              <w:spacing w:after="40"/>
+            </w:pPr>
+            <w:r>
+              <w:rPr>
+                <w:b/>
+                <w:sz w:val="18"/>
+              </w:rPr>
+              <w:t xml:space="preserve">Ask SPARKS</w:t>
+            </w:r>
+          </w:p>
+          <w:p>
+            <w:pPr>
+              <w:jc w:val="center"/>
+              <w:spacing w:after="0"/>
+            </w:pPr>
+            <w:r>
+              <w:rPr>
+                <w:sz w:val="15"/>
+              </w:rPr>
+              <w:t xml:space="preserve">User asks one natural-language question, including multi-part comparisons or follow-ups.</w:t>
+            </w:r>
+          </w:p>
+        </w:tc>
+        <w:tc>
+          <w:tcPr>
+            <w:tcW w:w="300" w:type="dxa"/>
+            <w:vAlign w:val="center"/>
+          </w:tcPr>
+          <w:p>
+            <w:pPr>
+              <w:jc w:val="center"/>
+            </w:pPr>
+            <w:r>
+              <w:rPr>
+                <w:color w:val="2E74B5"/>
+                <w:sz w:val="24"/>
+              </w:rPr>
+              <w:t>▶</w:t>
+            </w:r>
+          </w:p>
+        </w:tc>
+        <w:tc>
+          <w:tcPr>
+            <w:tcW w:w="0" w:type="auto"/>
+            <w:shd w:val="clear" w:fill="FFE6CC"/>
+            <w:tcBorders>
+              <w:top w:val="single" w:sz="12" w:color="D79B00"/>
+              <w:left w:val="single" w:sz="12" w:color="D79B00"/>
+              <w:bottom w:val="single" w:sz="12" w:color="D79B00"/>
+              <w:right w:val="single" w:sz="12" w:color="D79B00"/>
+            </w:tcBorders>
+            <w:vAlign w:val="center"/>
+          </w:tcPr>
+          <w:p>
+            <w:pPr>
+              <w:jc w:val="center"/>
+              <w:spacing w:after="40"/>
+            </w:pPr>
+            <w:r>
+              <w:rPr>
+                <w:b/>
+                <w:sz w:val="18"/>
+              </w:rPr>
+              <w:t xml:space="preserve">Agent Orchestrator</w:t>
+            </w:r>
+          </w:p>
+          <w:p>
+            <w:pPr>
+              <w:jc w:val="center"/>
+              <w:spacing w:after="0"/>
+            </w:pPr>
+            <w:r>
+              <w:rPr>
+                <w:sz w:val="15"/>
+              </w:rPr>
+              <w:t xml:space="preserve">Understand intent, plan steps, select approved tools, combine results and enforce guardrails.</w:t>
+            </w:r>
+          </w:p>
+        </w:tc>
+        <w:tc>
+          <w:tcPr>
+            <w:tcW w:w="300" w:type="dxa"/>
+            <w:vAlign w:val="center"/>
+          </w:tcPr>
+          <w:p>
+            <w:pPr>
+              <w:jc w:val="center"/>
+            </w:pPr>
+            <w:r>
+              <w:rPr>
+                <w:color w:val="2E74B5"/>
+                <w:sz w:val="24"/>
+              </w:rPr>
+              <w:t>▶</w:t>
+            </w:r>
+          </w:p>
+        </w:tc>
+        <w:tc>
+          <w:tcPr>
+            <w:tcW w:w="0" w:type="auto"/>
+            <w:shd w:val="clear" w:fill="E1D5E7"/>
+            <w:tcBorders>
+              <w:top w:val="single" w:sz="12" w:color="9673A6"/>
+              <w:left w:val="single" w:sz="12" w:color="9673A6"/>
+              <w:bottom w:val="single" w:sz="12" w:color="9673A6"/>
+              <w:right w:val="single" w:sz="12" w:color="9673A6"/>
+            </w:tcBorders>
+            <w:vAlign w:val="center"/>
+          </w:tcPr>
+          <w:p>
+            <w:pPr>
+              <w:jc w:val="center"/>
+              <w:spacing w:after="40"/>
+            </w:pPr>
+            <w:r>
+              <w:rPr>
+                <w:b/>
+                <w:sz w:val="18"/>
+              </w:rPr>
+              <w:t xml:space="preserve">Approved Tools</w:t>
+            </w:r>
+          </w:p>
+          <w:p>
+            <w:pPr>
+              <w:jc w:val="center"/>
+              <w:spacing w:after="0"/>
+            </w:pPr>
+            <w:r>
+              <w:rPr>
+                <w:sz w:val="15"/>
+              </w:rPr>
+              <w:t xml:space="preserve">Existing OpenSearch exact/filter search + semantic/vector retrieval + read-only record/detail APIs.</w:t>
+            </w:r>
+          </w:p>
+        </w:tc>
+        <w:tc>
+          <w:tcPr>
+            <w:tcW w:w="300" w:type="dxa"/>
+            <w:vAlign w:val="center"/>
+          </w:tcPr>
+          <w:p>
+            <w:pPr>
+              <w:jc w:val="center"/>
+            </w:pPr>
+            <w:r>
+              <w:rPr>
+                <w:color w:val="2E74B5"/>
+                <w:sz w:val="24"/>
+              </w:rPr>
+              <w:t>▶</w:t>
+            </w:r>
+          </w:p>
+        </w:tc>
+        <w:tc>
+          <w:tcPr>
+            <w:tcW w:w="0" w:type="auto"/>
+            <w:shd w:val="clear" w:fill="D5E8D4"/>
+            <w:tcBorders>
+              <w:top w:val="single" w:sz="12" w:color="82B366"/>
+              <w:left w:val="single" w:sz="12" w:color="82B366"/>
+              <w:bottom w:val="single" w:sz="12" w:color="82B366"/>
+              <w:right w:val="single" w:sz="12" w:color="82B366"/>
+            </w:tcBorders>
+            <w:vAlign w:val="center"/>
+          </w:tcPr>
+          <w:p>
+            <w:pPr>
+              <w:jc w:val="center"/>
+              <w:spacing w:after="40"/>
+            </w:pPr>
+            <w:r>
+              <w:rPr>
+                <w:b/>
+                <w:sz w:val="18"/>
+              </w:rPr>
+              <w:t xml:space="preserve">Claude</w:t>
+            </w:r>
+          </w:p>
+          <w:p>
+            <w:pPr>
+              <w:jc w:val="center"/>
+              <w:spacing w:after="0"/>
+            </w:pPr>
+            <w:r>
+              <w:rPr>
+                <w:sz w:val="15"/>
+              </w:rPr>
+              <w:t xml:space="preserve">Synthesize results, reason across retrieved records, and generate a grounded response.</w:t>
+            </w:r>
+          </w:p>
+        </w:tc>
+        <w:tc>
+          <w:tcPr>
+            <w:tcW w:w="300" w:type="dxa"/>
+            <w:vAlign w:val="center"/>
+          </w:tcPr>
+          <w:p>
+            <w:pPr>
+              <w:jc w:val="center"/>
+            </w:pPr>
+            <w:r>
+              <w:rPr>
+                <w:color w:val="2E74B5"/>
+                <w:sz w:val="24"/>
+              </w:rPr>
+              <w:t>▶</w:t>
+            </w:r>
+          </w:p>
+        </w:tc>
+        <w:tc>
+          <w:tcPr>
+            <w:tcW w:w="0" w:type="auto"/>
+            <w:shd w:val="clear" w:fill="DAE8FC"/>
+            <w:tcBorders>
+              <w:top w:val="single" w:sz="12" w:color="6C8EBF"/>
+              <w:left w:val="single" w:sz="12" w:color="6C8EBF"/>
+              <w:bottom w:val="single" w:sz="12" w:color="6C8EBF"/>
+              <w:right w:val="single" w:sz="12" w:color="6C8EBF"/>
+            </w:tcBorders>
+            <w:vAlign w:val="center"/>
+          </w:tcPr>
+          <w:p>
+            <w:pPr>
+              <w:jc w:val="center"/>
+              <w:spacing w:after="40"/>
+            </w:pPr>
+            <w:r>
+              <w:rPr>
+                <w:b/>
+                <w:sz w:val="18"/>
+              </w:rPr>
+              <w:t xml:space="preserve">Response</w:t>
+            </w:r>
+          </w:p>
+          <w:p>
+            <w:pPr>
+              <w:jc w:val="center"/>
+              <w:spacing w:after="0"/>
+            </w:pPr>
+            <w:r>
+              <w:rPr>
+                <w:sz w:val="15"/>
+              </w:rPr>
+              <w:t xml:space="preserve">Answer + structured results + source links/citations + follow-up questions.</w:t>
+            </w:r>
+          </w:p>
+        </w:tc>
+      </w:tr>
+    </w:tbl>
+    <w:p>
+      <w:pPr>
+        <w:numPr>
+          <w:ilvl w:val="0"/>
+          <w:numId w:val="1"/>
+        </w:numPr>
+      </w:pPr>
+      <w:r>
+        <w:t xml:space="preserve">No unrestricted SQL tool.</w:t>
+      </w:r>
+    </w:p>
+    <w:p>
+      <w:pPr>
+        <w:numPr>
+          <w:ilvl w:val="0"/>
+          <w:numId w:val="1"/>
+        </w:numPr>
+      </w:pPr>
+      <w:r>
+        <w:t xml:space="preserve">Existing OpenSearch becomes one tool; RAG/vector retrieval becomes another.</w:t>
+      </w:r>
+    </w:p>
+    <w:p>
+      <w:r>
+        <w:t/>
       </w:r>
     </w:p>
     <w:p>

</xml_diff>

<commit_message>
Fix flow diagrams getting cut off in the Word doc
- Give each flow box an explicit percentage width (5 boxes + 4 arrows = 100%) so Word
  splits the row evenly and text wraps (grows row height) instead of clipping
- Widen usable page width (L/R margins 1in -> 0.6in); borderless arrow cells; tighter line spacing
- Regenerated SPARKS_AI_Search_Proposal_FINAL.docx (+ .docx/.html); valid Microsoft Word 2007+
</commit_message>
<xml_diff>
--- a/sparks-ai-search/SPARKS_AI_Search_Proposal.docx
+++ b/sparks-ai-search/SPARKS_AI_Search_Proposal.docx
@@ -359,6 +359,12 @@
         <w:tblW w:w="5000" w:type="pct"/>
         <w:tblLayout w:type="fixed"/>
         <w:jc w:val="center"/>
+        <w:tblCellMar>
+          <w:top w:w="60" w:type="dxa"/>
+          <w:left w:w="60" w:type="dxa"/>
+          <w:bottom w:w="60" w:type="dxa"/>
+          <w:right w:w="60" w:type="dxa"/>
+        </w:tblCellMar>
       </w:tblPr>
       <w:tblGrid>
         <w:gridCol/>
@@ -372,9 +378,12 @@
         <w:gridCol/>
       </w:tblGrid>
       <w:tr>
-        <w:tc>
-          <w:tcPr>
-            <w:tcW w:w="0" w:type="auto"/>
+        <w:trPr>
+          <w:jc w:val="center"/>
+        </w:trPr>
+        <w:tc>
+          <w:tcPr>
+            <w:tcW w:w="856" w:type="pct"/>
             <w:shd w:val="clear" w:fill="DAE8FC"/>
             <w:tcBorders>
               <w:top w:val="single" w:sz="12" w:color="6C8EBF"/>
@@ -387,16 +396,40 @@
           <w:p>
             <w:pPr>
               <w:jc w:val="center"/>
-              <w:spacing w:after="40"/>
+              <w:spacing w:after="40" w:line="240" w:lineRule="auto"/>
             </w:pPr>
             <w:r>
               <w:rPr>
                 <w:b/>
-                <w:sz w:val="18"/>
+                <w:sz w:val="17"/>
               </w:rPr>
               <w:t xml:space="preserve">PostgreSQL</w:t>
             </w:r>
           </w:p>
+          <w:p>
+            <w:pPr>
+              <w:jc w:val="center"/>
+              <w:spacing w:after="0" w:line="216" w:lineRule="auto"/>
+            </w:pPr>
+            <w:r>
+              <w:rPr>
+                <w:sz w:val="14"/>
+              </w:rPr>
+              <w:t xml:space="preserve">Domain JSON builder functions create denormalized search document arrays.</w:t>
+            </w:r>
+          </w:p>
+        </w:tc>
+        <w:tc>
+          <w:tcPr>
+            <w:tcW w:w="180" w:type="pct"/>
+            <w:tcBorders>
+              <w:top w:val="nil"/>
+              <w:left w:val="nil"/>
+              <w:bottom w:val="nil"/>
+              <w:right w:val="nil"/>
+            </w:tcBorders>
+            <w:vAlign w:val="center"/>
+          </w:tcPr>
           <w:p>
             <w:pPr>
               <w:jc w:val="center"/>
@@ -404,25 +437,8 @@
             </w:pPr>
             <w:r>
               <w:rPr>
-                <w:sz w:val="15"/>
-              </w:rPr>
-              <w:t xml:space="preserve">Domain JSON builder functions create denormalized search document arrays.</w:t>
-            </w:r>
-          </w:p>
-        </w:tc>
-        <w:tc>
-          <w:tcPr>
-            <w:tcW w:w="300" w:type="dxa"/>
-            <w:vAlign w:val="center"/>
-          </w:tcPr>
-          <w:p>
-            <w:pPr>
-              <w:jc w:val="center"/>
-            </w:pPr>
-            <w:r>
-              <w:rPr>
                 <w:color w:val="2E74B5"/>
-                <w:sz w:val="24"/>
+                <w:sz w:val="22"/>
               </w:rPr>
               <w:t>▶</w:t>
             </w:r>
@@ -430,7 +446,7 @@
         </w:tc>
         <w:tc>
           <w:tcPr>
-            <w:tcW w:w="0" w:type="auto"/>
+            <w:tcW w:w="856" w:type="pct"/>
             <w:shd w:val="clear" w:fill="FFE6CC"/>
             <w:tcBorders>
               <w:top w:val="single" w:sz="12" w:color="D79B00"/>
@@ -443,16 +459,40 @@
           <w:p>
             <w:pPr>
               <w:jc w:val="center"/>
-              <w:spacing w:after="40"/>
+              <w:spacing w:after="40" w:line="240" w:lineRule="auto"/>
             </w:pPr>
             <w:r>
               <w:rPr>
                 <w:b/>
-                <w:sz w:val="18"/>
+                <w:sz w:val="17"/>
               </w:rPr>
               <w:t xml:space="preserve">open_search_json</w:t>
             </w:r>
           </w:p>
+          <w:p>
+            <w:pPr>
+              <w:jc w:val="center"/>
+              <w:spacing w:after="0" w:line="216" w:lineRule="auto"/>
+            </w:pPr>
+            <w:r>
+              <w:rPr>
+                <w:sz w:val="14"/>
+              </w:rPr>
+              <w:t xml:space="preserve">pushJsonData() stages JSON and sets read=false / processed=false.</w:t>
+            </w:r>
+          </w:p>
+        </w:tc>
+        <w:tc>
+          <w:tcPr>
+            <w:tcW w:w="180" w:type="pct"/>
+            <w:tcBorders>
+              <w:top w:val="nil"/>
+              <w:left w:val="nil"/>
+              <w:bottom w:val="nil"/>
+              <w:right w:val="nil"/>
+            </w:tcBorders>
+            <w:vAlign w:val="center"/>
+          </w:tcPr>
           <w:p>
             <w:pPr>
               <w:jc w:val="center"/>
@@ -460,25 +500,8 @@
             </w:pPr>
             <w:r>
               <w:rPr>
-                <w:sz w:val="15"/>
-              </w:rPr>
-              <w:t xml:space="preserve">pushJsonData() stages JSON and sets read=false / processed=false.</w:t>
-            </w:r>
-          </w:p>
-        </w:tc>
-        <w:tc>
-          <w:tcPr>
-            <w:tcW w:w="300" w:type="dxa"/>
-            <w:vAlign w:val="center"/>
-          </w:tcPr>
-          <w:p>
-            <w:pPr>
-              <w:jc w:val="center"/>
-            </w:pPr>
-            <w:r>
-              <w:rPr>
                 <w:color w:val="2E74B5"/>
-                <w:sz w:val="24"/>
+                <w:sz w:val="22"/>
               </w:rPr>
               <w:t>▶</w:t>
             </w:r>
@@ -486,7 +509,7 @@
         </w:tc>
         <w:tc>
           <w:tcPr>
-            <w:tcW w:w="0" w:type="auto"/>
+            <w:tcW w:w="856" w:type="pct"/>
             <w:shd w:val="clear" w:fill="E1D5E7"/>
             <w:tcBorders>
               <w:top w:val="single" w:sz="12" w:color="9673A6"/>
@@ -499,16 +522,40 @@
           <w:p>
             <w:pPr>
               <w:jc w:val="center"/>
-              <w:spacing w:after="40"/>
+              <w:spacing w:after="40" w:line="240" w:lineRule="auto"/>
             </w:pPr>
             <w:r>
               <w:rPr>
                 <w:b/>
-                <w:sz w:val="18"/>
+                <w:sz w:val="17"/>
               </w:rPr>
               <w:t xml:space="preserve">RDS → SQS</w:t>
             </w:r>
           </w:p>
+          <w:p>
+            <w:pPr>
+              <w:jc w:val="center"/>
+              <w:spacing w:after="0" w:line="216" w:lineRule="auto"/>
+            </w:pPr>
+            <w:r>
+              <w:rPr>
+                <w:sz w:val="14"/>
+              </w:rPr>
+              <w:t xml:space="preserve">Scheduled Lambda selects unread rows and sends osj_id + index name to SearchQueue.fifo.</w:t>
+            </w:r>
+          </w:p>
+        </w:tc>
+        <w:tc>
+          <w:tcPr>
+            <w:tcW w:w="180" w:type="pct"/>
+            <w:tcBorders>
+              <w:top w:val="nil"/>
+              <w:left w:val="nil"/>
+              <w:bottom w:val="nil"/>
+              <w:right w:val="nil"/>
+            </w:tcBorders>
+            <w:vAlign w:val="center"/>
+          </w:tcPr>
           <w:p>
             <w:pPr>
               <w:jc w:val="center"/>
@@ -516,25 +563,8 @@
             </w:pPr>
             <w:r>
               <w:rPr>
-                <w:sz w:val="15"/>
-              </w:rPr>
-              <w:t xml:space="preserve">Scheduled Lambda selects unread rows and sends osj_id + index name to SearchQueue.fifo.</w:t>
-            </w:r>
-          </w:p>
-        </w:tc>
-        <w:tc>
-          <w:tcPr>
-            <w:tcW w:w="300" w:type="dxa"/>
-            <w:vAlign w:val="center"/>
-          </w:tcPr>
-          <w:p>
-            <w:pPr>
-              <w:jc w:val="center"/>
-            </w:pPr>
-            <w:r>
-              <w:rPr>
                 <w:color w:val="2E74B5"/>
-                <w:sz w:val="24"/>
+                <w:sz w:val="22"/>
               </w:rPr>
               <w:t>▶</w:t>
             </w:r>
@@ -542,7 +572,7 @@
         </w:tc>
         <w:tc>
           <w:tcPr>
-            <w:tcW w:w="0" w:type="auto"/>
+            <w:tcW w:w="856" w:type="pct"/>
             <w:shd w:val="clear" w:fill="D5E8D4"/>
             <w:tcBorders>
               <w:top w:val="single" w:sz="12" w:color="82B366"/>
@@ -555,16 +585,40 @@
           <w:p>
             <w:pPr>
               <w:jc w:val="center"/>
-              <w:spacing w:after="40"/>
+              <w:spacing w:after="40" w:line="240" w:lineRule="auto"/>
             </w:pPr>
             <w:r>
               <w:rPr>
                 <w:b/>
-                <w:sz w:val="18"/>
+                <w:sz w:val="17"/>
               </w:rPr>
               <w:t xml:space="preserve">SQS → OpenSearch</w:t>
             </w:r>
           </w:p>
+          <w:p>
+            <w:pPr>
+              <w:jc w:val="center"/>
+              <w:spacing w:after="0" w:line="216" w:lineRule="auto"/>
+            </w:pPr>
+            <w:r>
+              <w:rPr>
+                <w:sz w:val="14"/>
+              </w:rPr>
+              <w:t xml:space="preserve">Consumer re-fetches JSON by osj_id, assigns stable IDs, bulk-indexes documents, then marks processed=true.</w:t>
+            </w:r>
+          </w:p>
+        </w:tc>
+        <w:tc>
+          <w:tcPr>
+            <w:tcW w:w="180" w:type="pct"/>
+            <w:tcBorders>
+              <w:top w:val="nil"/>
+              <w:left w:val="nil"/>
+              <w:bottom w:val="nil"/>
+              <w:right w:val="nil"/>
+            </w:tcBorders>
+            <w:vAlign w:val="center"/>
+          </w:tcPr>
           <w:p>
             <w:pPr>
               <w:jc w:val="center"/>
@@ -572,25 +626,8 @@
             </w:pPr>
             <w:r>
               <w:rPr>
-                <w:sz w:val="15"/>
-              </w:rPr>
-              <w:t xml:space="preserve">Consumer re-fetches JSON by osj_id, assigns stable IDs, bulk-indexes documents, then marks processed=true.</w:t>
-            </w:r>
-          </w:p>
-        </w:tc>
-        <w:tc>
-          <w:tcPr>
-            <w:tcW w:w="300" w:type="dxa"/>
-            <w:vAlign w:val="center"/>
-          </w:tcPr>
-          <w:p>
-            <w:pPr>
-              <w:jc w:val="center"/>
-            </w:pPr>
-            <w:r>
-              <w:rPr>
                 <w:color w:val="2E74B5"/>
-                <w:sz w:val="24"/>
+                <w:sz w:val="22"/>
               </w:rPr>
               <w:t>▶</w:t>
             </w:r>
@@ -598,7 +635,7 @@
         </w:tc>
         <w:tc>
           <w:tcPr>
-            <w:tcW w:w="0" w:type="auto"/>
+            <w:tcW w:w="856" w:type="pct"/>
             <w:shd w:val="clear" w:fill="DAE8FC"/>
             <w:tcBorders>
               <w:top w:val="single" w:sz="12" w:color="6C8EBF"/>
@@ -611,12 +648,12 @@
           <w:p>
             <w:pPr>
               <w:jc w:val="center"/>
-              <w:spacing w:after="40"/>
+              <w:spacing w:after="40" w:line="240" w:lineRule="auto"/>
             </w:pPr>
             <w:r>
               <w:rPr>
                 <w:b/>
-                <w:sz w:val="18"/>
+                <w:sz w:val="17"/>
               </w:rPr>
               <w:t xml:space="preserve">OpenSearch</w:t>
             </w:r>
@@ -624,11 +661,11 @@
           <w:p>
             <w:pPr>
               <w:jc w:val="center"/>
-              <w:spacing w:after="0"/>
+              <w:spacing w:after="0" w:line="216" w:lineRule="auto"/>
             </w:pPr>
             <w:r>
               <w:rPr>
-                <w:sz w:val="15"/>
+                <w:sz w:val="14"/>
               </w:rPr>
               <w:t xml:space="preserve">Current SPARKS keyword, pills and filter search continues to query the indexed documents.</w:t>
             </w:r>
@@ -1414,6 +1451,12 @@
         <w:tblW w:w="5000" w:type="pct"/>
         <w:tblLayout w:type="fixed"/>
         <w:jc w:val="center"/>
+        <w:tblCellMar>
+          <w:top w:w="60" w:type="dxa"/>
+          <w:left w:w="60" w:type="dxa"/>
+          <w:bottom w:w="60" w:type="dxa"/>
+          <w:right w:w="60" w:type="dxa"/>
+        </w:tblCellMar>
       </w:tblPr>
       <w:tblGrid>
         <w:gridCol/>
@@ -1427,9 +1470,12 @@
         <w:gridCol/>
       </w:tblGrid>
       <w:tr>
-        <w:tc>
-          <w:tcPr>
-            <w:tcW w:w="0" w:type="auto"/>
+        <w:trPr>
+          <w:jc w:val="center"/>
+        </w:trPr>
+        <w:tc>
+          <w:tcPr>
+            <w:tcW w:w="856" w:type="pct"/>
             <w:shd w:val="clear" w:fill="DAE8FC"/>
             <w:tcBorders>
               <w:top w:val="single" w:sz="12" w:color="6C8EBF"/>
@@ -1442,16 +1488,40 @@
           <w:p>
             <w:pPr>
               <w:jc w:val="center"/>
-              <w:spacing w:after="40"/>
+              <w:spacing w:after="40" w:line="240" w:lineRule="auto"/>
             </w:pPr>
             <w:r>
               <w:rPr>
                 <w:b/>
-                <w:sz w:val="18"/>
+                <w:sz w:val="17"/>
               </w:rPr>
               <w:t xml:space="preserve">SPARKS Data</w:t>
             </w:r>
           </w:p>
+          <w:p>
+            <w:pPr>
+              <w:jc w:val="center"/>
+              <w:spacing w:after="0" w:line="216" w:lineRule="auto"/>
+            </w:pPr>
+            <w:r>
+              <w:rPr>
+                <w:sz w:val="14"/>
+              </w:rPr>
+              <w:t xml:space="preserve">Read-only source. Reuse current domain JSON where sufficient; enrich or create AI-specific domain JSON for gaps.</w:t>
+            </w:r>
+          </w:p>
+        </w:tc>
+        <w:tc>
+          <w:tcPr>
+            <w:tcW w:w="180" w:type="pct"/>
+            <w:tcBorders>
+              <w:top w:val="nil"/>
+              <w:left w:val="nil"/>
+              <w:bottom w:val="nil"/>
+              <w:right w:val="nil"/>
+            </w:tcBorders>
+            <w:vAlign w:val="center"/>
+          </w:tcPr>
           <w:p>
             <w:pPr>
               <w:jc w:val="center"/>
@@ -1459,25 +1529,8 @@
             </w:pPr>
             <w:r>
               <w:rPr>
-                <w:sz w:val="15"/>
-              </w:rPr>
-              <w:t xml:space="preserve">Read-only source. Reuse current domain JSON where sufficient; enrich or create AI-specific domain JSON for gaps.</w:t>
-            </w:r>
-          </w:p>
-        </w:tc>
-        <w:tc>
-          <w:tcPr>
-            <w:tcW w:w="300" w:type="dxa"/>
-            <w:vAlign w:val="center"/>
-          </w:tcPr>
-          <w:p>
-            <w:pPr>
-              <w:jc w:val="center"/>
-            </w:pPr>
-            <w:r>
-              <w:rPr>
                 <w:color w:val="2E74B5"/>
-                <w:sz w:val="24"/>
+                <w:sz w:val="22"/>
               </w:rPr>
               <w:t>▶</w:t>
             </w:r>
@@ -1485,7 +1538,7 @@
         </w:tc>
         <w:tc>
           <w:tcPr>
-            <w:tcW w:w="0" w:type="auto"/>
+            <w:tcW w:w="856" w:type="pct"/>
             <w:shd w:val="clear" w:fill="FFE6CC"/>
             <w:tcBorders>
               <w:top w:val="single" w:sz="12" w:color="D79B00"/>
@@ -1498,16 +1551,40 @@
           <w:p>
             <w:pPr>
               <w:jc w:val="center"/>
-              <w:spacing w:after="40"/>
+              <w:spacing w:after="40" w:line="240" w:lineRule="auto"/>
             </w:pPr>
             <w:r>
               <w:rPr>
                 <w:b/>
-                <w:sz w:val="18"/>
+                <w:sz w:val="17"/>
               </w:rPr>
               <w:t xml:space="preserve">AI Data Prep</w:t>
             </w:r>
           </w:p>
+          <w:p>
+            <w:pPr>
+              <w:jc w:val="center"/>
+              <w:spacing w:after="0" w:line="216" w:lineRule="auto"/>
+            </w:pPr>
+            <w:r>
+              <w:rPr>
+                <w:sz w:val="14"/>
+              </w:rPr>
+              <w:t xml:space="preserve">Normalize and curate approved investigation, vehicle, equipment, test and reference content. Preserve source record identifiers.</w:t>
+            </w:r>
+          </w:p>
+        </w:tc>
+        <w:tc>
+          <w:tcPr>
+            <w:tcW w:w="180" w:type="pct"/>
+            <w:tcBorders>
+              <w:top w:val="nil"/>
+              <w:left w:val="nil"/>
+              <w:bottom w:val="nil"/>
+              <w:right w:val="nil"/>
+            </w:tcBorders>
+            <w:vAlign w:val="center"/>
+          </w:tcPr>
           <w:p>
             <w:pPr>
               <w:jc w:val="center"/>
@@ -1515,25 +1592,8 @@
             </w:pPr>
             <w:r>
               <w:rPr>
-                <w:sz w:val="15"/>
-              </w:rPr>
-              <w:t xml:space="preserve">Normalize and curate approved investigation, vehicle, equipment, test and reference content. Preserve source record identifiers.</w:t>
-            </w:r>
-          </w:p>
-        </w:tc>
-        <w:tc>
-          <w:tcPr>
-            <w:tcW w:w="300" w:type="dxa"/>
-            <w:vAlign w:val="center"/>
-          </w:tcPr>
-          <w:p>
-            <w:pPr>
-              <w:jc w:val="center"/>
-            </w:pPr>
-            <w:r>
-              <w:rPr>
                 <w:color w:val="2E74B5"/>
-                <w:sz w:val="24"/>
+                <w:sz w:val="22"/>
               </w:rPr>
               <w:t>▶</w:t>
             </w:r>
@@ -1541,7 +1601,7 @@
         </w:tc>
         <w:tc>
           <w:tcPr>
-            <w:tcW w:w="0" w:type="auto"/>
+            <w:tcW w:w="856" w:type="pct"/>
             <w:shd w:val="clear" w:fill="E1D5E7"/>
             <w:tcBorders>
               <w:top w:val="single" w:sz="12" w:color="9673A6"/>
@@ -1554,16 +1614,40 @@
           <w:p>
             <w:pPr>
               <w:jc w:val="center"/>
-              <w:spacing w:after="40"/>
+              <w:spacing w:after="40" w:line="240" w:lineRule="auto"/>
             </w:pPr>
             <w:r>
               <w:rPr>
                 <w:b/>
-                <w:sz w:val="18"/>
+                <w:sz w:val="17"/>
               </w:rPr>
               <w:t xml:space="preserve">RAG Search Content</w:t>
             </w:r>
           </w:p>
+          <w:p>
+            <w:pPr>
+              <w:jc w:val="center"/>
+              <w:spacing w:after="0" w:line="216" w:lineRule="auto"/>
+            </w:pPr>
+            <w:r>
+              <w:rPr>
+                <w:sz w:val="14"/>
+              </w:rPr>
+              <w:t xml:space="preserve">Store curated content in an approved AI data layer and index embeddings in a vector store.</w:t>
+            </w:r>
+          </w:p>
+        </w:tc>
+        <w:tc>
+          <w:tcPr>
+            <w:tcW w:w="180" w:type="pct"/>
+            <w:tcBorders>
+              <w:top w:val="nil"/>
+              <w:left w:val="nil"/>
+              <w:bottom w:val="nil"/>
+              <w:right w:val="nil"/>
+            </w:tcBorders>
+            <w:vAlign w:val="center"/>
+          </w:tcPr>
           <w:p>
             <w:pPr>
               <w:jc w:val="center"/>
@@ -1571,25 +1655,8 @@
             </w:pPr>
             <w:r>
               <w:rPr>
-                <w:sz w:val="15"/>
-              </w:rPr>
-              <w:t xml:space="preserve">Store curated content in an approved AI data layer and index embeddings in a vector store.</w:t>
-            </w:r>
-          </w:p>
-        </w:tc>
-        <w:tc>
-          <w:tcPr>
-            <w:tcW w:w="300" w:type="dxa"/>
-            <w:vAlign w:val="center"/>
-          </w:tcPr>
-          <w:p>
-            <w:pPr>
-              <w:jc w:val="center"/>
-            </w:pPr>
-            <w:r>
-              <w:rPr>
                 <w:color w:val="2E74B5"/>
-                <w:sz w:val="24"/>
+                <w:sz w:val="22"/>
               </w:rPr>
               <w:t>▶</w:t>
             </w:r>
@@ -1597,7 +1664,7 @@
         </w:tc>
         <w:tc>
           <w:tcPr>
-            <w:tcW w:w="0" w:type="auto"/>
+            <w:tcW w:w="856" w:type="pct"/>
             <w:shd w:val="clear" w:fill="D5E8D4"/>
             <w:tcBorders>
               <w:top w:val="single" w:sz="12" w:color="82B366"/>
@@ -1610,16 +1677,40 @@
           <w:p>
             <w:pPr>
               <w:jc w:val="center"/>
-              <w:spacing w:after="40"/>
+              <w:spacing w:after="40" w:line="240" w:lineRule="auto"/>
             </w:pPr>
             <w:r>
               <w:rPr>
                 <w:b/>
-                <w:sz w:val="18"/>
+                <w:sz w:val="17"/>
               </w:rPr>
               <w:t xml:space="preserve">Bedrock + Claude</w:t>
             </w:r>
           </w:p>
+          <w:p>
+            <w:pPr>
+              <w:jc w:val="center"/>
+              <w:spacing w:after="0" w:line="216" w:lineRule="auto"/>
+            </w:pPr>
+            <w:r>
+              <w:rPr>
+                <w:sz w:val="14"/>
+              </w:rPr>
+              <w:t xml:space="preserve">Retrieve relevant chunks, apply metadata filters, and generate a grounded answer with source citations.</w:t>
+            </w:r>
+          </w:p>
+        </w:tc>
+        <w:tc>
+          <w:tcPr>
+            <w:tcW w:w="180" w:type="pct"/>
+            <w:tcBorders>
+              <w:top w:val="nil"/>
+              <w:left w:val="nil"/>
+              <w:bottom w:val="nil"/>
+              <w:right w:val="nil"/>
+            </w:tcBorders>
+            <w:vAlign w:val="center"/>
+          </w:tcPr>
           <w:p>
             <w:pPr>
               <w:jc w:val="center"/>
@@ -1627,25 +1718,8 @@
             </w:pPr>
             <w:r>
               <w:rPr>
-                <w:sz w:val="15"/>
-              </w:rPr>
-              <w:t xml:space="preserve">Retrieve relevant chunks, apply metadata filters, and generate a grounded answer with source citations.</w:t>
-            </w:r>
-          </w:p>
-        </w:tc>
-        <w:tc>
-          <w:tcPr>
-            <w:tcW w:w="300" w:type="dxa"/>
-            <w:vAlign w:val="center"/>
-          </w:tcPr>
-          <w:p>
-            <w:pPr>
-              <w:jc w:val="center"/>
-            </w:pPr>
-            <w:r>
-              <w:rPr>
                 <w:color w:val="2E74B5"/>
-                <w:sz w:val="24"/>
+                <w:sz w:val="22"/>
               </w:rPr>
               <w:t>▶</w:t>
             </w:r>
@@ -1653,7 +1727,7 @@
         </w:tc>
         <w:tc>
           <w:tcPr>
-            <w:tcW w:w="0" w:type="auto"/>
+            <w:tcW w:w="856" w:type="pct"/>
             <w:shd w:val="clear" w:fill="DAE8FC"/>
             <w:tcBorders>
               <w:top w:val="single" w:sz="12" w:color="6C8EBF"/>
@@ -1666,12 +1740,12 @@
           <w:p>
             <w:pPr>
               <w:jc w:val="center"/>
-              <w:spacing w:after="40"/>
+              <w:spacing w:after="40" w:line="240" w:lineRule="auto"/>
             </w:pPr>
             <w:r>
               <w:rPr>
                 <w:b/>
-                <w:sz w:val="18"/>
+                <w:sz w:val="17"/>
               </w:rPr>
               <w:t xml:space="preserve">Ask SPARKS</w:t>
             </w:r>
@@ -1679,11 +1753,11 @@
           <w:p>
             <w:pPr>
               <w:jc w:val="center"/>
-              <w:spacing w:after="0"/>
+              <w:spacing w:after="0" w:line="216" w:lineRule="auto"/>
             </w:pPr>
             <w:r>
               <w:rPr>
-                <w:sz w:val="15"/>
+                <w:sz w:val="14"/>
               </w:rPr>
               <w:t xml:space="preserve">Natural-language questions, summaries, similar cases, citations and follow-up questions in the SPARKS UI.</w:t>
             </w:r>
@@ -2213,6 +2287,12 @@
         <w:tblW w:w="5000" w:type="pct"/>
         <w:tblLayout w:type="fixed"/>
         <w:jc w:val="center"/>
+        <w:tblCellMar>
+          <w:top w:w="60" w:type="dxa"/>
+          <w:left w:w="60" w:type="dxa"/>
+          <w:bottom w:w="60" w:type="dxa"/>
+          <w:right w:w="60" w:type="dxa"/>
+        </w:tblCellMar>
       </w:tblPr>
       <w:tblGrid>
         <w:gridCol/>
@@ -2226,9 +2306,12 @@
         <w:gridCol/>
       </w:tblGrid>
       <w:tr>
-        <w:tc>
-          <w:tcPr>
-            <w:tcW w:w="0" w:type="auto"/>
+        <w:trPr>
+          <w:jc w:val="center"/>
+        </w:trPr>
+        <w:tc>
+          <w:tcPr>
+            <w:tcW w:w="856" w:type="pct"/>
             <w:shd w:val="clear" w:fill="DAE8FC"/>
             <w:tcBorders>
               <w:top w:val="single" w:sz="12" w:color="6C8EBF"/>
@@ -2241,16 +2324,40 @@
           <w:p>
             <w:pPr>
               <w:jc w:val="center"/>
-              <w:spacing w:after="40"/>
+              <w:spacing w:after="40" w:line="240" w:lineRule="auto"/>
             </w:pPr>
             <w:r>
               <w:rPr>
                 <w:b/>
-                <w:sz w:val="18"/>
+                <w:sz w:val="17"/>
               </w:rPr>
               <w:t xml:space="preserve">Ask SPARKS</w:t>
             </w:r>
           </w:p>
+          <w:p>
+            <w:pPr>
+              <w:jc w:val="center"/>
+              <w:spacing w:after="0" w:line="216" w:lineRule="auto"/>
+            </w:pPr>
+            <w:r>
+              <w:rPr>
+                <w:sz w:val="14"/>
+              </w:rPr>
+              <w:t xml:space="preserve">User asks one natural-language question, including multi-part comparisons or follow-ups.</w:t>
+            </w:r>
+          </w:p>
+        </w:tc>
+        <w:tc>
+          <w:tcPr>
+            <w:tcW w:w="180" w:type="pct"/>
+            <w:tcBorders>
+              <w:top w:val="nil"/>
+              <w:left w:val="nil"/>
+              <w:bottom w:val="nil"/>
+              <w:right w:val="nil"/>
+            </w:tcBorders>
+            <w:vAlign w:val="center"/>
+          </w:tcPr>
           <w:p>
             <w:pPr>
               <w:jc w:val="center"/>
@@ -2258,25 +2365,8 @@
             </w:pPr>
             <w:r>
               <w:rPr>
-                <w:sz w:val="15"/>
-              </w:rPr>
-              <w:t xml:space="preserve">User asks one natural-language question, including multi-part comparisons or follow-ups.</w:t>
-            </w:r>
-          </w:p>
-        </w:tc>
-        <w:tc>
-          <w:tcPr>
-            <w:tcW w:w="300" w:type="dxa"/>
-            <w:vAlign w:val="center"/>
-          </w:tcPr>
-          <w:p>
-            <w:pPr>
-              <w:jc w:val="center"/>
-            </w:pPr>
-            <w:r>
-              <w:rPr>
                 <w:color w:val="2E74B5"/>
-                <w:sz w:val="24"/>
+                <w:sz w:val="22"/>
               </w:rPr>
               <w:t>▶</w:t>
             </w:r>
@@ -2284,7 +2374,7 @@
         </w:tc>
         <w:tc>
           <w:tcPr>
-            <w:tcW w:w="0" w:type="auto"/>
+            <w:tcW w:w="856" w:type="pct"/>
             <w:shd w:val="clear" w:fill="FFE6CC"/>
             <w:tcBorders>
               <w:top w:val="single" w:sz="12" w:color="D79B00"/>
@@ -2297,16 +2387,40 @@
           <w:p>
             <w:pPr>
               <w:jc w:val="center"/>
-              <w:spacing w:after="40"/>
+              <w:spacing w:after="40" w:line="240" w:lineRule="auto"/>
             </w:pPr>
             <w:r>
               <w:rPr>
                 <w:b/>
-                <w:sz w:val="18"/>
+                <w:sz w:val="17"/>
               </w:rPr>
               <w:t xml:space="preserve">Agent Orchestrator</w:t>
             </w:r>
           </w:p>
+          <w:p>
+            <w:pPr>
+              <w:jc w:val="center"/>
+              <w:spacing w:after="0" w:line="216" w:lineRule="auto"/>
+            </w:pPr>
+            <w:r>
+              <w:rPr>
+                <w:sz w:val="14"/>
+              </w:rPr>
+              <w:t xml:space="preserve">Understand intent, plan steps, select approved tools, combine results and enforce guardrails.</w:t>
+            </w:r>
+          </w:p>
+        </w:tc>
+        <w:tc>
+          <w:tcPr>
+            <w:tcW w:w="180" w:type="pct"/>
+            <w:tcBorders>
+              <w:top w:val="nil"/>
+              <w:left w:val="nil"/>
+              <w:bottom w:val="nil"/>
+              <w:right w:val="nil"/>
+            </w:tcBorders>
+            <w:vAlign w:val="center"/>
+          </w:tcPr>
           <w:p>
             <w:pPr>
               <w:jc w:val="center"/>
@@ -2314,25 +2428,8 @@
             </w:pPr>
             <w:r>
               <w:rPr>
-                <w:sz w:val="15"/>
-              </w:rPr>
-              <w:t xml:space="preserve">Understand intent, plan steps, select approved tools, combine results and enforce guardrails.</w:t>
-            </w:r>
-          </w:p>
-        </w:tc>
-        <w:tc>
-          <w:tcPr>
-            <w:tcW w:w="300" w:type="dxa"/>
-            <w:vAlign w:val="center"/>
-          </w:tcPr>
-          <w:p>
-            <w:pPr>
-              <w:jc w:val="center"/>
-            </w:pPr>
-            <w:r>
-              <w:rPr>
                 <w:color w:val="2E74B5"/>
-                <w:sz w:val="24"/>
+                <w:sz w:val="22"/>
               </w:rPr>
               <w:t>▶</w:t>
             </w:r>
@@ -2340,7 +2437,7 @@
         </w:tc>
         <w:tc>
           <w:tcPr>
-            <w:tcW w:w="0" w:type="auto"/>
+            <w:tcW w:w="856" w:type="pct"/>
             <w:shd w:val="clear" w:fill="E1D5E7"/>
             <w:tcBorders>
               <w:top w:val="single" w:sz="12" w:color="9673A6"/>
@@ -2353,16 +2450,40 @@
           <w:p>
             <w:pPr>
               <w:jc w:val="center"/>
-              <w:spacing w:after="40"/>
+              <w:spacing w:after="40" w:line="240" w:lineRule="auto"/>
             </w:pPr>
             <w:r>
               <w:rPr>
                 <w:b/>
-                <w:sz w:val="18"/>
+                <w:sz w:val="17"/>
               </w:rPr>
               <w:t xml:space="preserve">Approved Tools</w:t>
             </w:r>
           </w:p>
+          <w:p>
+            <w:pPr>
+              <w:jc w:val="center"/>
+              <w:spacing w:after="0" w:line="216" w:lineRule="auto"/>
+            </w:pPr>
+            <w:r>
+              <w:rPr>
+                <w:sz w:val="14"/>
+              </w:rPr>
+              <w:t xml:space="preserve">Existing OpenSearch exact/filter search + semantic/vector retrieval + read-only record/detail APIs.</w:t>
+            </w:r>
+          </w:p>
+        </w:tc>
+        <w:tc>
+          <w:tcPr>
+            <w:tcW w:w="180" w:type="pct"/>
+            <w:tcBorders>
+              <w:top w:val="nil"/>
+              <w:left w:val="nil"/>
+              <w:bottom w:val="nil"/>
+              <w:right w:val="nil"/>
+            </w:tcBorders>
+            <w:vAlign w:val="center"/>
+          </w:tcPr>
           <w:p>
             <w:pPr>
               <w:jc w:val="center"/>
@@ -2370,25 +2491,8 @@
             </w:pPr>
             <w:r>
               <w:rPr>
-                <w:sz w:val="15"/>
-              </w:rPr>
-              <w:t xml:space="preserve">Existing OpenSearch exact/filter search + semantic/vector retrieval + read-only record/detail APIs.</w:t>
-            </w:r>
-          </w:p>
-        </w:tc>
-        <w:tc>
-          <w:tcPr>
-            <w:tcW w:w="300" w:type="dxa"/>
-            <w:vAlign w:val="center"/>
-          </w:tcPr>
-          <w:p>
-            <w:pPr>
-              <w:jc w:val="center"/>
-            </w:pPr>
-            <w:r>
-              <w:rPr>
                 <w:color w:val="2E74B5"/>
-                <w:sz w:val="24"/>
+                <w:sz w:val="22"/>
               </w:rPr>
               <w:t>▶</w:t>
             </w:r>
@@ -2396,7 +2500,7 @@
         </w:tc>
         <w:tc>
           <w:tcPr>
-            <w:tcW w:w="0" w:type="auto"/>
+            <w:tcW w:w="856" w:type="pct"/>
             <w:shd w:val="clear" w:fill="D5E8D4"/>
             <w:tcBorders>
               <w:top w:val="single" w:sz="12" w:color="82B366"/>
@@ -2409,16 +2513,40 @@
           <w:p>
             <w:pPr>
               <w:jc w:val="center"/>
-              <w:spacing w:after="40"/>
+              <w:spacing w:after="40" w:line="240" w:lineRule="auto"/>
             </w:pPr>
             <w:r>
               <w:rPr>
                 <w:b/>
-                <w:sz w:val="18"/>
+                <w:sz w:val="17"/>
               </w:rPr>
               <w:t xml:space="preserve">Claude</w:t>
             </w:r>
           </w:p>
+          <w:p>
+            <w:pPr>
+              <w:jc w:val="center"/>
+              <w:spacing w:after="0" w:line="216" w:lineRule="auto"/>
+            </w:pPr>
+            <w:r>
+              <w:rPr>
+                <w:sz w:val="14"/>
+              </w:rPr>
+              <w:t xml:space="preserve">Synthesize results, reason across retrieved records, and generate a grounded response.</w:t>
+            </w:r>
+          </w:p>
+        </w:tc>
+        <w:tc>
+          <w:tcPr>
+            <w:tcW w:w="180" w:type="pct"/>
+            <w:tcBorders>
+              <w:top w:val="nil"/>
+              <w:left w:val="nil"/>
+              <w:bottom w:val="nil"/>
+              <w:right w:val="nil"/>
+            </w:tcBorders>
+            <w:vAlign w:val="center"/>
+          </w:tcPr>
           <w:p>
             <w:pPr>
               <w:jc w:val="center"/>
@@ -2426,25 +2554,8 @@
             </w:pPr>
             <w:r>
               <w:rPr>
-                <w:sz w:val="15"/>
-              </w:rPr>
-              <w:t xml:space="preserve">Synthesize results, reason across retrieved records, and generate a grounded response.</w:t>
-            </w:r>
-          </w:p>
-        </w:tc>
-        <w:tc>
-          <w:tcPr>
-            <w:tcW w:w="300" w:type="dxa"/>
-            <w:vAlign w:val="center"/>
-          </w:tcPr>
-          <w:p>
-            <w:pPr>
-              <w:jc w:val="center"/>
-            </w:pPr>
-            <w:r>
-              <w:rPr>
                 <w:color w:val="2E74B5"/>
-                <w:sz w:val="24"/>
+                <w:sz w:val="22"/>
               </w:rPr>
               <w:t>▶</w:t>
             </w:r>
@@ -2452,7 +2563,7 @@
         </w:tc>
         <w:tc>
           <w:tcPr>
-            <w:tcW w:w="0" w:type="auto"/>
+            <w:tcW w:w="856" w:type="pct"/>
             <w:shd w:val="clear" w:fill="DAE8FC"/>
             <w:tcBorders>
               <w:top w:val="single" w:sz="12" w:color="6C8EBF"/>
@@ -2465,12 +2576,12 @@
           <w:p>
             <w:pPr>
               <w:jc w:val="center"/>
-              <w:spacing w:after="40"/>
+              <w:spacing w:after="40" w:line="240" w:lineRule="auto"/>
             </w:pPr>
             <w:r>
               <w:rPr>
                 <w:b/>
-                <w:sz w:val="18"/>
+                <w:sz w:val="17"/>
               </w:rPr>
               <w:t xml:space="preserve">Response</w:t>
             </w:r>
@@ -2478,11 +2589,11 @@
           <w:p>
             <w:pPr>
               <w:jc w:val="center"/>
-              <w:spacing w:after="0"/>
+              <w:spacing w:after="0" w:line="216" w:lineRule="auto"/>
             </w:pPr>
             <w:r>
               <w:rPr>
-                <w:sz w:val="15"/>
+                <w:sz w:val="14"/>
               </w:rPr>
               <w:t xml:space="preserve">Answer + structured results + source links/citations + follow-up questions.</w:t>
             </w:r>
@@ -4160,7 +4271,7 @@
     </w:p>
     <w:sectPr>
       <w:pgSz w:w="12240" w:h="15840"/>
-      <w:pgMar w:top="1440" w:right="1440" w:bottom="1440" w:left="1440" w:header="720" w:footer="720" w:gutter="0"/>
+      <w:pgMar w:top="1152" w:right="864" w:bottom="1152" w:left="864" w:header="720" w:footer="720" w:gutter="0"/>
     </w:sectPr>
   </w:body>
 </w:document>

</xml_diff>

<commit_message>
Fix flow diagrams getting cut off in the Word doc (#11)
- Give each flow box an explicit percentage width (5 boxes + 4 arrows = 100%) so Word
  splits the row evenly and text wraps (grows row height) instead of clipping
- Widen usable page width (L/R margins 1in -> 0.6in); borderless arrow cells; tighter line spacing
- Regenerated SPARKS_AI_Search_Proposal_FINAL.docx (+ .docx/.html); valid Microsoft Word 2007+

Co-authored-by: Kiro Agent <agent@kiro.dev>
</commit_message>
<xml_diff>
--- a/sparks-ai-search/SPARKS_AI_Search_Proposal.docx
+++ b/sparks-ai-search/SPARKS_AI_Search_Proposal.docx
@@ -359,6 +359,12 @@
         <w:tblW w:w="5000" w:type="pct"/>
         <w:tblLayout w:type="fixed"/>
         <w:jc w:val="center"/>
+        <w:tblCellMar>
+          <w:top w:w="60" w:type="dxa"/>
+          <w:left w:w="60" w:type="dxa"/>
+          <w:bottom w:w="60" w:type="dxa"/>
+          <w:right w:w="60" w:type="dxa"/>
+        </w:tblCellMar>
       </w:tblPr>
       <w:tblGrid>
         <w:gridCol/>
@@ -372,9 +378,12 @@
         <w:gridCol/>
       </w:tblGrid>
       <w:tr>
-        <w:tc>
-          <w:tcPr>
-            <w:tcW w:w="0" w:type="auto"/>
+        <w:trPr>
+          <w:jc w:val="center"/>
+        </w:trPr>
+        <w:tc>
+          <w:tcPr>
+            <w:tcW w:w="856" w:type="pct"/>
             <w:shd w:val="clear" w:fill="DAE8FC"/>
             <w:tcBorders>
               <w:top w:val="single" w:sz="12" w:color="6C8EBF"/>
@@ -387,16 +396,40 @@
           <w:p>
             <w:pPr>
               <w:jc w:val="center"/>
-              <w:spacing w:after="40"/>
+              <w:spacing w:after="40" w:line="240" w:lineRule="auto"/>
             </w:pPr>
             <w:r>
               <w:rPr>
                 <w:b/>
-                <w:sz w:val="18"/>
+                <w:sz w:val="17"/>
               </w:rPr>
               <w:t xml:space="preserve">PostgreSQL</w:t>
             </w:r>
           </w:p>
+          <w:p>
+            <w:pPr>
+              <w:jc w:val="center"/>
+              <w:spacing w:after="0" w:line="216" w:lineRule="auto"/>
+            </w:pPr>
+            <w:r>
+              <w:rPr>
+                <w:sz w:val="14"/>
+              </w:rPr>
+              <w:t xml:space="preserve">Domain JSON builder functions create denormalized search document arrays.</w:t>
+            </w:r>
+          </w:p>
+        </w:tc>
+        <w:tc>
+          <w:tcPr>
+            <w:tcW w:w="180" w:type="pct"/>
+            <w:tcBorders>
+              <w:top w:val="nil"/>
+              <w:left w:val="nil"/>
+              <w:bottom w:val="nil"/>
+              <w:right w:val="nil"/>
+            </w:tcBorders>
+            <w:vAlign w:val="center"/>
+          </w:tcPr>
           <w:p>
             <w:pPr>
               <w:jc w:val="center"/>
@@ -404,25 +437,8 @@
             </w:pPr>
             <w:r>
               <w:rPr>
-                <w:sz w:val="15"/>
-              </w:rPr>
-              <w:t xml:space="preserve">Domain JSON builder functions create denormalized search document arrays.</w:t>
-            </w:r>
-          </w:p>
-        </w:tc>
-        <w:tc>
-          <w:tcPr>
-            <w:tcW w:w="300" w:type="dxa"/>
-            <w:vAlign w:val="center"/>
-          </w:tcPr>
-          <w:p>
-            <w:pPr>
-              <w:jc w:val="center"/>
-            </w:pPr>
-            <w:r>
-              <w:rPr>
                 <w:color w:val="2E74B5"/>
-                <w:sz w:val="24"/>
+                <w:sz w:val="22"/>
               </w:rPr>
               <w:t>▶</w:t>
             </w:r>
@@ -430,7 +446,7 @@
         </w:tc>
         <w:tc>
           <w:tcPr>
-            <w:tcW w:w="0" w:type="auto"/>
+            <w:tcW w:w="856" w:type="pct"/>
             <w:shd w:val="clear" w:fill="FFE6CC"/>
             <w:tcBorders>
               <w:top w:val="single" w:sz="12" w:color="D79B00"/>
@@ -443,16 +459,40 @@
           <w:p>
             <w:pPr>
               <w:jc w:val="center"/>
-              <w:spacing w:after="40"/>
+              <w:spacing w:after="40" w:line="240" w:lineRule="auto"/>
             </w:pPr>
             <w:r>
               <w:rPr>
                 <w:b/>
-                <w:sz w:val="18"/>
+                <w:sz w:val="17"/>
               </w:rPr>
               <w:t xml:space="preserve">open_search_json</w:t>
             </w:r>
           </w:p>
+          <w:p>
+            <w:pPr>
+              <w:jc w:val="center"/>
+              <w:spacing w:after="0" w:line="216" w:lineRule="auto"/>
+            </w:pPr>
+            <w:r>
+              <w:rPr>
+                <w:sz w:val="14"/>
+              </w:rPr>
+              <w:t xml:space="preserve">pushJsonData() stages JSON and sets read=false / processed=false.</w:t>
+            </w:r>
+          </w:p>
+        </w:tc>
+        <w:tc>
+          <w:tcPr>
+            <w:tcW w:w="180" w:type="pct"/>
+            <w:tcBorders>
+              <w:top w:val="nil"/>
+              <w:left w:val="nil"/>
+              <w:bottom w:val="nil"/>
+              <w:right w:val="nil"/>
+            </w:tcBorders>
+            <w:vAlign w:val="center"/>
+          </w:tcPr>
           <w:p>
             <w:pPr>
               <w:jc w:val="center"/>
@@ -460,25 +500,8 @@
             </w:pPr>
             <w:r>
               <w:rPr>
-                <w:sz w:val="15"/>
-              </w:rPr>
-              <w:t xml:space="preserve">pushJsonData() stages JSON and sets read=false / processed=false.</w:t>
-            </w:r>
-          </w:p>
-        </w:tc>
-        <w:tc>
-          <w:tcPr>
-            <w:tcW w:w="300" w:type="dxa"/>
-            <w:vAlign w:val="center"/>
-          </w:tcPr>
-          <w:p>
-            <w:pPr>
-              <w:jc w:val="center"/>
-            </w:pPr>
-            <w:r>
-              <w:rPr>
                 <w:color w:val="2E74B5"/>
-                <w:sz w:val="24"/>
+                <w:sz w:val="22"/>
               </w:rPr>
               <w:t>▶</w:t>
             </w:r>
@@ -486,7 +509,7 @@
         </w:tc>
         <w:tc>
           <w:tcPr>
-            <w:tcW w:w="0" w:type="auto"/>
+            <w:tcW w:w="856" w:type="pct"/>
             <w:shd w:val="clear" w:fill="E1D5E7"/>
             <w:tcBorders>
               <w:top w:val="single" w:sz="12" w:color="9673A6"/>
@@ -499,16 +522,40 @@
           <w:p>
             <w:pPr>
               <w:jc w:val="center"/>
-              <w:spacing w:after="40"/>
+              <w:spacing w:after="40" w:line="240" w:lineRule="auto"/>
             </w:pPr>
             <w:r>
               <w:rPr>
                 <w:b/>
-                <w:sz w:val="18"/>
+                <w:sz w:val="17"/>
               </w:rPr>
               <w:t xml:space="preserve">RDS → SQS</w:t>
             </w:r>
           </w:p>
+          <w:p>
+            <w:pPr>
+              <w:jc w:val="center"/>
+              <w:spacing w:after="0" w:line="216" w:lineRule="auto"/>
+            </w:pPr>
+            <w:r>
+              <w:rPr>
+                <w:sz w:val="14"/>
+              </w:rPr>
+              <w:t xml:space="preserve">Scheduled Lambda selects unread rows and sends osj_id + index name to SearchQueue.fifo.</w:t>
+            </w:r>
+          </w:p>
+        </w:tc>
+        <w:tc>
+          <w:tcPr>
+            <w:tcW w:w="180" w:type="pct"/>
+            <w:tcBorders>
+              <w:top w:val="nil"/>
+              <w:left w:val="nil"/>
+              <w:bottom w:val="nil"/>
+              <w:right w:val="nil"/>
+            </w:tcBorders>
+            <w:vAlign w:val="center"/>
+          </w:tcPr>
           <w:p>
             <w:pPr>
               <w:jc w:val="center"/>
@@ -516,25 +563,8 @@
             </w:pPr>
             <w:r>
               <w:rPr>
-                <w:sz w:val="15"/>
-              </w:rPr>
-              <w:t xml:space="preserve">Scheduled Lambda selects unread rows and sends osj_id + index name to SearchQueue.fifo.</w:t>
-            </w:r>
-          </w:p>
-        </w:tc>
-        <w:tc>
-          <w:tcPr>
-            <w:tcW w:w="300" w:type="dxa"/>
-            <w:vAlign w:val="center"/>
-          </w:tcPr>
-          <w:p>
-            <w:pPr>
-              <w:jc w:val="center"/>
-            </w:pPr>
-            <w:r>
-              <w:rPr>
                 <w:color w:val="2E74B5"/>
-                <w:sz w:val="24"/>
+                <w:sz w:val="22"/>
               </w:rPr>
               <w:t>▶</w:t>
             </w:r>
@@ -542,7 +572,7 @@
         </w:tc>
         <w:tc>
           <w:tcPr>
-            <w:tcW w:w="0" w:type="auto"/>
+            <w:tcW w:w="856" w:type="pct"/>
             <w:shd w:val="clear" w:fill="D5E8D4"/>
             <w:tcBorders>
               <w:top w:val="single" w:sz="12" w:color="82B366"/>
@@ -555,16 +585,40 @@
           <w:p>
             <w:pPr>
               <w:jc w:val="center"/>
-              <w:spacing w:after="40"/>
+              <w:spacing w:after="40" w:line="240" w:lineRule="auto"/>
             </w:pPr>
             <w:r>
               <w:rPr>
                 <w:b/>
-                <w:sz w:val="18"/>
+                <w:sz w:val="17"/>
               </w:rPr>
               <w:t xml:space="preserve">SQS → OpenSearch</w:t>
             </w:r>
           </w:p>
+          <w:p>
+            <w:pPr>
+              <w:jc w:val="center"/>
+              <w:spacing w:after="0" w:line="216" w:lineRule="auto"/>
+            </w:pPr>
+            <w:r>
+              <w:rPr>
+                <w:sz w:val="14"/>
+              </w:rPr>
+              <w:t xml:space="preserve">Consumer re-fetches JSON by osj_id, assigns stable IDs, bulk-indexes documents, then marks processed=true.</w:t>
+            </w:r>
+          </w:p>
+        </w:tc>
+        <w:tc>
+          <w:tcPr>
+            <w:tcW w:w="180" w:type="pct"/>
+            <w:tcBorders>
+              <w:top w:val="nil"/>
+              <w:left w:val="nil"/>
+              <w:bottom w:val="nil"/>
+              <w:right w:val="nil"/>
+            </w:tcBorders>
+            <w:vAlign w:val="center"/>
+          </w:tcPr>
           <w:p>
             <w:pPr>
               <w:jc w:val="center"/>
@@ -572,25 +626,8 @@
             </w:pPr>
             <w:r>
               <w:rPr>
-                <w:sz w:val="15"/>
-              </w:rPr>
-              <w:t xml:space="preserve">Consumer re-fetches JSON by osj_id, assigns stable IDs, bulk-indexes documents, then marks processed=true.</w:t>
-            </w:r>
-          </w:p>
-        </w:tc>
-        <w:tc>
-          <w:tcPr>
-            <w:tcW w:w="300" w:type="dxa"/>
-            <w:vAlign w:val="center"/>
-          </w:tcPr>
-          <w:p>
-            <w:pPr>
-              <w:jc w:val="center"/>
-            </w:pPr>
-            <w:r>
-              <w:rPr>
                 <w:color w:val="2E74B5"/>
-                <w:sz w:val="24"/>
+                <w:sz w:val="22"/>
               </w:rPr>
               <w:t>▶</w:t>
             </w:r>
@@ -598,7 +635,7 @@
         </w:tc>
         <w:tc>
           <w:tcPr>
-            <w:tcW w:w="0" w:type="auto"/>
+            <w:tcW w:w="856" w:type="pct"/>
             <w:shd w:val="clear" w:fill="DAE8FC"/>
             <w:tcBorders>
               <w:top w:val="single" w:sz="12" w:color="6C8EBF"/>
@@ -611,12 +648,12 @@
           <w:p>
             <w:pPr>
               <w:jc w:val="center"/>
-              <w:spacing w:after="40"/>
+              <w:spacing w:after="40" w:line="240" w:lineRule="auto"/>
             </w:pPr>
             <w:r>
               <w:rPr>
                 <w:b/>
-                <w:sz w:val="18"/>
+                <w:sz w:val="17"/>
               </w:rPr>
               <w:t xml:space="preserve">OpenSearch</w:t>
             </w:r>
@@ -624,11 +661,11 @@
           <w:p>
             <w:pPr>
               <w:jc w:val="center"/>
-              <w:spacing w:after="0"/>
+              <w:spacing w:after="0" w:line="216" w:lineRule="auto"/>
             </w:pPr>
             <w:r>
               <w:rPr>
-                <w:sz w:val="15"/>
+                <w:sz w:val="14"/>
               </w:rPr>
               <w:t xml:space="preserve">Current SPARKS keyword, pills and filter search continues to query the indexed documents.</w:t>
             </w:r>
@@ -1414,6 +1451,12 @@
         <w:tblW w:w="5000" w:type="pct"/>
         <w:tblLayout w:type="fixed"/>
         <w:jc w:val="center"/>
+        <w:tblCellMar>
+          <w:top w:w="60" w:type="dxa"/>
+          <w:left w:w="60" w:type="dxa"/>
+          <w:bottom w:w="60" w:type="dxa"/>
+          <w:right w:w="60" w:type="dxa"/>
+        </w:tblCellMar>
       </w:tblPr>
       <w:tblGrid>
         <w:gridCol/>
@@ -1427,9 +1470,12 @@
         <w:gridCol/>
       </w:tblGrid>
       <w:tr>
-        <w:tc>
-          <w:tcPr>
-            <w:tcW w:w="0" w:type="auto"/>
+        <w:trPr>
+          <w:jc w:val="center"/>
+        </w:trPr>
+        <w:tc>
+          <w:tcPr>
+            <w:tcW w:w="856" w:type="pct"/>
             <w:shd w:val="clear" w:fill="DAE8FC"/>
             <w:tcBorders>
               <w:top w:val="single" w:sz="12" w:color="6C8EBF"/>
@@ -1442,16 +1488,40 @@
           <w:p>
             <w:pPr>
               <w:jc w:val="center"/>
-              <w:spacing w:after="40"/>
+              <w:spacing w:after="40" w:line="240" w:lineRule="auto"/>
             </w:pPr>
             <w:r>
               <w:rPr>
                 <w:b/>
-                <w:sz w:val="18"/>
+                <w:sz w:val="17"/>
               </w:rPr>
               <w:t xml:space="preserve">SPARKS Data</w:t>
             </w:r>
           </w:p>
+          <w:p>
+            <w:pPr>
+              <w:jc w:val="center"/>
+              <w:spacing w:after="0" w:line="216" w:lineRule="auto"/>
+            </w:pPr>
+            <w:r>
+              <w:rPr>
+                <w:sz w:val="14"/>
+              </w:rPr>
+              <w:t xml:space="preserve">Read-only source. Reuse current domain JSON where sufficient; enrich or create AI-specific domain JSON for gaps.</w:t>
+            </w:r>
+          </w:p>
+        </w:tc>
+        <w:tc>
+          <w:tcPr>
+            <w:tcW w:w="180" w:type="pct"/>
+            <w:tcBorders>
+              <w:top w:val="nil"/>
+              <w:left w:val="nil"/>
+              <w:bottom w:val="nil"/>
+              <w:right w:val="nil"/>
+            </w:tcBorders>
+            <w:vAlign w:val="center"/>
+          </w:tcPr>
           <w:p>
             <w:pPr>
               <w:jc w:val="center"/>
@@ -1459,25 +1529,8 @@
             </w:pPr>
             <w:r>
               <w:rPr>
-                <w:sz w:val="15"/>
-              </w:rPr>
-              <w:t xml:space="preserve">Read-only source. Reuse current domain JSON where sufficient; enrich or create AI-specific domain JSON for gaps.</w:t>
-            </w:r>
-          </w:p>
-        </w:tc>
-        <w:tc>
-          <w:tcPr>
-            <w:tcW w:w="300" w:type="dxa"/>
-            <w:vAlign w:val="center"/>
-          </w:tcPr>
-          <w:p>
-            <w:pPr>
-              <w:jc w:val="center"/>
-            </w:pPr>
-            <w:r>
-              <w:rPr>
                 <w:color w:val="2E74B5"/>
-                <w:sz w:val="24"/>
+                <w:sz w:val="22"/>
               </w:rPr>
               <w:t>▶</w:t>
             </w:r>
@@ -1485,7 +1538,7 @@
         </w:tc>
         <w:tc>
           <w:tcPr>
-            <w:tcW w:w="0" w:type="auto"/>
+            <w:tcW w:w="856" w:type="pct"/>
             <w:shd w:val="clear" w:fill="FFE6CC"/>
             <w:tcBorders>
               <w:top w:val="single" w:sz="12" w:color="D79B00"/>
@@ -1498,16 +1551,40 @@
           <w:p>
             <w:pPr>
               <w:jc w:val="center"/>
-              <w:spacing w:after="40"/>
+              <w:spacing w:after="40" w:line="240" w:lineRule="auto"/>
             </w:pPr>
             <w:r>
               <w:rPr>
                 <w:b/>
-                <w:sz w:val="18"/>
+                <w:sz w:val="17"/>
               </w:rPr>
               <w:t xml:space="preserve">AI Data Prep</w:t>
             </w:r>
           </w:p>
+          <w:p>
+            <w:pPr>
+              <w:jc w:val="center"/>
+              <w:spacing w:after="0" w:line="216" w:lineRule="auto"/>
+            </w:pPr>
+            <w:r>
+              <w:rPr>
+                <w:sz w:val="14"/>
+              </w:rPr>
+              <w:t xml:space="preserve">Normalize and curate approved investigation, vehicle, equipment, test and reference content. Preserve source record identifiers.</w:t>
+            </w:r>
+          </w:p>
+        </w:tc>
+        <w:tc>
+          <w:tcPr>
+            <w:tcW w:w="180" w:type="pct"/>
+            <w:tcBorders>
+              <w:top w:val="nil"/>
+              <w:left w:val="nil"/>
+              <w:bottom w:val="nil"/>
+              <w:right w:val="nil"/>
+            </w:tcBorders>
+            <w:vAlign w:val="center"/>
+          </w:tcPr>
           <w:p>
             <w:pPr>
               <w:jc w:val="center"/>
@@ -1515,25 +1592,8 @@
             </w:pPr>
             <w:r>
               <w:rPr>
-                <w:sz w:val="15"/>
-              </w:rPr>
-              <w:t xml:space="preserve">Normalize and curate approved investigation, vehicle, equipment, test and reference content. Preserve source record identifiers.</w:t>
-            </w:r>
-          </w:p>
-        </w:tc>
-        <w:tc>
-          <w:tcPr>
-            <w:tcW w:w="300" w:type="dxa"/>
-            <w:vAlign w:val="center"/>
-          </w:tcPr>
-          <w:p>
-            <w:pPr>
-              <w:jc w:val="center"/>
-            </w:pPr>
-            <w:r>
-              <w:rPr>
                 <w:color w:val="2E74B5"/>
-                <w:sz w:val="24"/>
+                <w:sz w:val="22"/>
               </w:rPr>
               <w:t>▶</w:t>
             </w:r>
@@ -1541,7 +1601,7 @@
         </w:tc>
         <w:tc>
           <w:tcPr>
-            <w:tcW w:w="0" w:type="auto"/>
+            <w:tcW w:w="856" w:type="pct"/>
             <w:shd w:val="clear" w:fill="E1D5E7"/>
             <w:tcBorders>
               <w:top w:val="single" w:sz="12" w:color="9673A6"/>
@@ -1554,16 +1614,40 @@
           <w:p>
             <w:pPr>
               <w:jc w:val="center"/>
-              <w:spacing w:after="40"/>
+              <w:spacing w:after="40" w:line="240" w:lineRule="auto"/>
             </w:pPr>
             <w:r>
               <w:rPr>
                 <w:b/>
-                <w:sz w:val="18"/>
+                <w:sz w:val="17"/>
               </w:rPr>
               <w:t xml:space="preserve">RAG Search Content</w:t>
             </w:r>
           </w:p>
+          <w:p>
+            <w:pPr>
+              <w:jc w:val="center"/>
+              <w:spacing w:after="0" w:line="216" w:lineRule="auto"/>
+            </w:pPr>
+            <w:r>
+              <w:rPr>
+                <w:sz w:val="14"/>
+              </w:rPr>
+              <w:t xml:space="preserve">Store curated content in an approved AI data layer and index embeddings in a vector store.</w:t>
+            </w:r>
+          </w:p>
+        </w:tc>
+        <w:tc>
+          <w:tcPr>
+            <w:tcW w:w="180" w:type="pct"/>
+            <w:tcBorders>
+              <w:top w:val="nil"/>
+              <w:left w:val="nil"/>
+              <w:bottom w:val="nil"/>
+              <w:right w:val="nil"/>
+            </w:tcBorders>
+            <w:vAlign w:val="center"/>
+          </w:tcPr>
           <w:p>
             <w:pPr>
               <w:jc w:val="center"/>
@@ -1571,25 +1655,8 @@
             </w:pPr>
             <w:r>
               <w:rPr>
-                <w:sz w:val="15"/>
-              </w:rPr>
-              <w:t xml:space="preserve">Store curated content in an approved AI data layer and index embeddings in a vector store.</w:t>
-            </w:r>
-          </w:p>
-        </w:tc>
-        <w:tc>
-          <w:tcPr>
-            <w:tcW w:w="300" w:type="dxa"/>
-            <w:vAlign w:val="center"/>
-          </w:tcPr>
-          <w:p>
-            <w:pPr>
-              <w:jc w:val="center"/>
-            </w:pPr>
-            <w:r>
-              <w:rPr>
                 <w:color w:val="2E74B5"/>
-                <w:sz w:val="24"/>
+                <w:sz w:val="22"/>
               </w:rPr>
               <w:t>▶</w:t>
             </w:r>
@@ -1597,7 +1664,7 @@
         </w:tc>
         <w:tc>
           <w:tcPr>
-            <w:tcW w:w="0" w:type="auto"/>
+            <w:tcW w:w="856" w:type="pct"/>
             <w:shd w:val="clear" w:fill="D5E8D4"/>
             <w:tcBorders>
               <w:top w:val="single" w:sz="12" w:color="82B366"/>
@@ -1610,16 +1677,40 @@
           <w:p>
             <w:pPr>
               <w:jc w:val="center"/>
-              <w:spacing w:after="40"/>
+              <w:spacing w:after="40" w:line="240" w:lineRule="auto"/>
             </w:pPr>
             <w:r>
               <w:rPr>
                 <w:b/>
-                <w:sz w:val="18"/>
+                <w:sz w:val="17"/>
               </w:rPr>
               <w:t xml:space="preserve">Bedrock + Claude</w:t>
             </w:r>
           </w:p>
+          <w:p>
+            <w:pPr>
+              <w:jc w:val="center"/>
+              <w:spacing w:after="0" w:line="216" w:lineRule="auto"/>
+            </w:pPr>
+            <w:r>
+              <w:rPr>
+                <w:sz w:val="14"/>
+              </w:rPr>
+              <w:t xml:space="preserve">Retrieve relevant chunks, apply metadata filters, and generate a grounded answer with source citations.</w:t>
+            </w:r>
+          </w:p>
+        </w:tc>
+        <w:tc>
+          <w:tcPr>
+            <w:tcW w:w="180" w:type="pct"/>
+            <w:tcBorders>
+              <w:top w:val="nil"/>
+              <w:left w:val="nil"/>
+              <w:bottom w:val="nil"/>
+              <w:right w:val="nil"/>
+            </w:tcBorders>
+            <w:vAlign w:val="center"/>
+          </w:tcPr>
           <w:p>
             <w:pPr>
               <w:jc w:val="center"/>
@@ -1627,25 +1718,8 @@
             </w:pPr>
             <w:r>
               <w:rPr>
-                <w:sz w:val="15"/>
-              </w:rPr>
-              <w:t xml:space="preserve">Retrieve relevant chunks, apply metadata filters, and generate a grounded answer with source citations.</w:t>
-            </w:r>
-          </w:p>
-        </w:tc>
-        <w:tc>
-          <w:tcPr>
-            <w:tcW w:w="300" w:type="dxa"/>
-            <w:vAlign w:val="center"/>
-          </w:tcPr>
-          <w:p>
-            <w:pPr>
-              <w:jc w:val="center"/>
-            </w:pPr>
-            <w:r>
-              <w:rPr>
                 <w:color w:val="2E74B5"/>
-                <w:sz w:val="24"/>
+                <w:sz w:val="22"/>
               </w:rPr>
               <w:t>▶</w:t>
             </w:r>
@@ -1653,7 +1727,7 @@
         </w:tc>
         <w:tc>
           <w:tcPr>
-            <w:tcW w:w="0" w:type="auto"/>
+            <w:tcW w:w="856" w:type="pct"/>
             <w:shd w:val="clear" w:fill="DAE8FC"/>
             <w:tcBorders>
               <w:top w:val="single" w:sz="12" w:color="6C8EBF"/>
@@ -1666,12 +1740,12 @@
           <w:p>
             <w:pPr>
               <w:jc w:val="center"/>
-              <w:spacing w:after="40"/>
+              <w:spacing w:after="40" w:line="240" w:lineRule="auto"/>
             </w:pPr>
             <w:r>
               <w:rPr>
                 <w:b/>
-                <w:sz w:val="18"/>
+                <w:sz w:val="17"/>
               </w:rPr>
               <w:t xml:space="preserve">Ask SPARKS</w:t>
             </w:r>
@@ -1679,11 +1753,11 @@
           <w:p>
             <w:pPr>
               <w:jc w:val="center"/>
-              <w:spacing w:after="0"/>
+              <w:spacing w:after="0" w:line="216" w:lineRule="auto"/>
             </w:pPr>
             <w:r>
               <w:rPr>
-                <w:sz w:val="15"/>
+                <w:sz w:val="14"/>
               </w:rPr>
               <w:t xml:space="preserve">Natural-language questions, summaries, similar cases, citations and follow-up questions in the SPARKS UI.</w:t>
             </w:r>
@@ -2213,6 +2287,12 @@
         <w:tblW w:w="5000" w:type="pct"/>
         <w:tblLayout w:type="fixed"/>
         <w:jc w:val="center"/>
+        <w:tblCellMar>
+          <w:top w:w="60" w:type="dxa"/>
+          <w:left w:w="60" w:type="dxa"/>
+          <w:bottom w:w="60" w:type="dxa"/>
+          <w:right w:w="60" w:type="dxa"/>
+        </w:tblCellMar>
       </w:tblPr>
       <w:tblGrid>
         <w:gridCol/>
@@ -2226,9 +2306,12 @@
         <w:gridCol/>
       </w:tblGrid>
       <w:tr>
-        <w:tc>
-          <w:tcPr>
-            <w:tcW w:w="0" w:type="auto"/>
+        <w:trPr>
+          <w:jc w:val="center"/>
+        </w:trPr>
+        <w:tc>
+          <w:tcPr>
+            <w:tcW w:w="856" w:type="pct"/>
             <w:shd w:val="clear" w:fill="DAE8FC"/>
             <w:tcBorders>
               <w:top w:val="single" w:sz="12" w:color="6C8EBF"/>
@@ -2241,16 +2324,40 @@
           <w:p>
             <w:pPr>
               <w:jc w:val="center"/>
-              <w:spacing w:after="40"/>
+              <w:spacing w:after="40" w:line="240" w:lineRule="auto"/>
             </w:pPr>
             <w:r>
               <w:rPr>
                 <w:b/>
-                <w:sz w:val="18"/>
+                <w:sz w:val="17"/>
               </w:rPr>
               <w:t xml:space="preserve">Ask SPARKS</w:t>
             </w:r>
           </w:p>
+          <w:p>
+            <w:pPr>
+              <w:jc w:val="center"/>
+              <w:spacing w:after="0" w:line="216" w:lineRule="auto"/>
+            </w:pPr>
+            <w:r>
+              <w:rPr>
+                <w:sz w:val="14"/>
+              </w:rPr>
+              <w:t xml:space="preserve">User asks one natural-language question, including multi-part comparisons or follow-ups.</w:t>
+            </w:r>
+          </w:p>
+        </w:tc>
+        <w:tc>
+          <w:tcPr>
+            <w:tcW w:w="180" w:type="pct"/>
+            <w:tcBorders>
+              <w:top w:val="nil"/>
+              <w:left w:val="nil"/>
+              <w:bottom w:val="nil"/>
+              <w:right w:val="nil"/>
+            </w:tcBorders>
+            <w:vAlign w:val="center"/>
+          </w:tcPr>
           <w:p>
             <w:pPr>
               <w:jc w:val="center"/>
@@ -2258,25 +2365,8 @@
             </w:pPr>
             <w:r>
               <w:rPr>
-                <w:sz w:val="15"/>
-              </w:rPr>
-              <w:t xml:space="preserve">User asks one natural-language question, including multi-part comparisons or follow-ups.</w:t>
-            </w:r>
-          </w:p>
-        </w:tc>
-        <w:tc>
-          <w:tcPr>
-            <w:tcW w:w="300" w:type="dxa"/>
-            <w:vAlign w:val="center"/>
-          </w:tcPr>
-          <w:p>
-            <w:pPr>
-              <w:jc w:val="center"/>
-            </w:pPr>
-            <w:r>
-              <w:rPr>
                 <w:color w:val="2E74B5"/>
-                <w:sz w:val="24"/>
+                <w:sz w:val="22"/>
               </w:rPr>
               <w:t>▶</w:t>
             </w:r>
@@ -2284,7 +2374,7 @@
         </w:tc>
         <w:tc>
           <w:tcPr>
-            <w:tcW w:w="0" w:type="auto"/>
+            <w:tcW w:w="856" w:type="pct"/>
             <w:shd w:val="clear" w:fill="FFE6CC"/>
             <w:tcBorders>
               <w:top w:val="single" w:sz="12" w:color="D79B00"/>
@@ -2297,16 +2387,40 @@
           <w:p>
             <w:pPr>
               <w:jc w:val="center"/>
-              <w:spacing w:after="40"/>
+              <w:spacing w:after="40" w:line="240" w:lineRule="auto"/>
             </w:pPr>
             <w:r>
               <w:rPr>
                 <w:b/>
-                <w:sz w:val="18"/>
+                <w:sz w:val="17"/>
               </w:rPr>
               <w:t xml:space="preserve">Agent Orchestrator</w:t>
             </w:r>
           </w:p>
+          <w:p>
+            <w:pPr>
+              <w:jc w:val="center"/>
+              <w:spacing w:after="0" w:line="216" w:lineRule="auto"/>
+            </w:pPr>
+            <w:r>
+              <w:rPr>
+                <w:sz w:val="14"/>
+              </w:rPr>
+              <w:t xml:space="preserve">Understand intent, plan steps, select approved tools, combine results and enforce guardrails.</w:t>
+            </w:r>
+          </w:p>
+        </w:tc>
+        <w:tc>
+          <w:tcPr>
+            <w:tcW w:w="180" w:type="pct"/>
+            <w:tcBorders>
+              <w:top w:val="nil"/>
+              <w:left w:val="nil"/>
+              <w:bottom w:val="nil"/>
+              <w:right w:val="nil"/>
+            </w:tcBorders>
+            <w:vAlign w:val="center"/>
+          </w:tcPr>
           <w:p>
             <w:pPr>
               <w:jc w:val="center"/>
@@ -2314,25 +2428,8 @@
             </w:pPr>
             <w:r>
               <w:rPr>
-                <w:sz w:val="15"/>
-              </w:rPr>
-              <w:t xml:space="preserve">Understand intent, plan steps, select approved tools, combine results and enforce guardrails.</w:t>
-            </w:r>
-          </w:p>
-        </w:tc>
-        <w:tc>
-          <w:tcPr>
-            <w:tcW w:w="300" w:type="dxa"/>
-            <w:vAlign w:val="center"/>
-          </w:tcPr>
-          <w:p>
-            <w:pPr>
-              <w:jc w:val="center"/>
-            </w:pPr>
-            <w:r>
-              <w:rPr>
                 <w:color w:val="2E74B5"/>
-                <w:sz w:val="24"/>
+                <w:sz w:val="22"/>
               </w:rPr>
               <w:t>▶</w:t>
             </w:r>
@@ -2340,7 +2437,7 @@
         </w:tc>
         <w:tc>
           <w:tcPr>
-            <w:tcW w:w="0" w:type="auto"/>
+            <w:tcW w:w="856" w:type="pct"/>
             <w:shd w:val="clear" w:fill="E1D5E7"/>
             <w:tcBorders>
               <w:top w:val="single" w:sz="12" w:color="9673A6"/>
@@ -2353,16 +2450,40 @@
           <w:p>
             <w:pPr>
               <w:jc w:val="center"/>
-              <w:spacing w:after="40"/>
+              <w:spacing w:after="40" w:line="240" w:lineRule="auto"/>
             </w:pPr>
             <w:r>
               <w:rPr>
                 <w:b/>
-                <w:sz w:val="18"/>
+                <w:sz w:val="17"/>
               </w:rPr>
               <w:t xml:space="preserve">Approved Tools</w:t>
             </w:r>
           </w:p>
+          <w:p>
+            <w:pPr>
+              <w:jc w:val="center"/>
+              <w:spacing w:after="0" w:line="216" w:lineRule="auto"/>
+            </w:pPr>
+            <w:r>
+              <w:rPr>
+                <w:sz w:val="14"/>
+              </w:rPr>
+              <w:t xml:space="preserve">Existing OpenSearch exact/filter search + semantic/vector retrieval + read-only record/detail APIs.</w:t>
+            </w:r>
+          </w:p>
+        </w:tc>
+        <w:tc>
+          <w:tcPr>
+            <w:tcW w:w="180" w:type="pct"/>
+            <w:tcBorders>
+              <w:top w:val="nil"/>
+              <w:left w:val="nil"/>
+              <w:bottom w:val="nil"/>
+              <w:right w:val="nil"/>
+            </w:tcBorders>
+            <w:vAlign w:val="center"/>
+          </w:tcPr>
           <w:p>
             <w:pPr>
               <w:jc w:val="center"/>
@@ -2370,25 +2491,8 @@
             </w:pPr>
             <w:r>
               <w:rPr>
-                <w:sz w:val="15"/>
-              </w:rPr>
-              <w:t xml:space="preserve">Existing OpenSearch exact/filter search + semantic/vector retrieval + read-only record/detail APIs.</w:t>
-            </w:r>
-          </w:p>
-        </w:tc>
-        <w:tc>
-          <w:tcPr>
-            <w:tcW w:w="300" w:type="dxa"/>
-            <w:vAlign w:val="center"/>
-          </w:tcPr>
-          <w:p>
-            <w:pPr>
-              <w:jc w:val="center"/>
-            </w:pPr>
-            <w:r>
-              <w:rPr>
                 <w:color w:val="2E74B5"/>
-                <w:sz w:val="24"/>
+                <w:sz w:val="22"/>
               </w:rPr>
               <w:t>▶</w:t>
             </w:r>
@@ -2396,7 +2500,7 @@
         </w:tc>
         <w:tc>
           <w:tcPr>
-            <w:tcW w:w="0" w:type="auto"/>
+            <w:tcW w:w="856" w:type="pct"/>
             <w:shd w:val="clear" w:fill="D5E8D4"/>
             <w:tcBorders>
               <w:top w:val="single" w:sz="12" w:color="82B366"/>
@@ -2409,16 +2513,40 @@
           <w:p>
             <w:pPr>
               <w:jc w:val="center"/>
-              <w:spacing w:after="40"/>
+              <w:spacing w:after="40" w:line="240" w:lineRule="auto"/>
             </w:pPr>
             <w:r>
               <w:rPr>
                 <w:b/>
-                <w:sz w:val="18"/>
+                <w:sz w:val="17"/>
               </w:rPr>
               <w:t xml:space="preserve">Claude</w:t>
             </w:r>
           </w:p>
+          <w:p>
+            <w:pPr>
+              <w:jc w:val="center"/>
+              <w:spacing w:after="0" w:line="216" w:lineRule="auto"/>
+            </w:pPr>
+            <w:r>
+              <w:rPr>
+                <w:sz w:val="14"/>
+              </w:rPr>
+              <w:t xml:space="preserve">Synthesize results, reason across retrieved records, and generate a grounded response.</w:t>
+            </w:r>
+          </w:p>
+        </w:tc>
+        <w:tc>
+          <w:tcPr>
+            <w:tcW w:w="180" w:type="pct"/>
+            <w:tcBorders>
+              <w:top w:val="nil"/>
+              <w:left w:val="nil"/>
+              <w:bottom w:val="nil"/>
+              <w:right w:val="nil"/>
+            </w:tcBorders>
+            <w:vAlign w:val="center"/>
+          </w:tcPr>
           <w:p>
             <w:pPr>
               <w:jc w:val="center"/>
@@ -2426,25 +2554,8 @@
             </w:pPr>
             <w:r>
               <w:rPr>
-                <w:sz w:val="15"/>
-              </w:rPr>
-              <w:t xml:space="preserve">Synthesize results, reason across retrieved records, and generate a grounded response.</w:t>
-            </w:r>
-          </w:p>
-        </w:tc>
-        <w:tc>
-          <w:tcPr>
-            <w:tcW w:w="300" w:type="dxa"/>
-            <w:vAlign w:val="center"/>
-          </w:tcPr>
-          <w:p>
-            <w:pPr>
-              <w:jc w:val="center"/>
-            </w:pPr>
-            <w:r>
-              <w:rPr>
                 <w:color w:val="2E74B5"/>
-                <w:sz w:val="24"/>
+                <w:sz w:val="22"/>
               </w:rPr>
               <w:t>▶</w:t>
             </w:r>
@@ -2452,7 +2563,7 @@
         </w:tc>
         <w:tc>
           <w:tcPr>
-            <w:tcW w:w="0" w:type="auto"/>
+            <w:tcW w:w="856" w:type="pct"/>
             <w:shd w:val="clear" w:fill="DAE8FC"/>
             <w:tcBorders>
               <w:top w:val="single" w:sz="12" w:color="6C8EBF"/>
@@ -2465,12 +2576,12 @@
           <w:p>
             <w:pPr>
               <w:jc w:val="center"/>
-              <w:spacing w:after="40"/>
+              <w:spacing w:after="40" w:line="240" w:lineRule="auto"/>
             </w:pPr>
             <w:r>
               <w:rPr>
                 <w:b/>
-                <w:sz w:val="18"/>
+                <w:sz w:val="17"/>
               </w:rPr>
               <w:t xml:space="preserve">Response</w:t>
             </w:r>
@@ -2478,11 +2589,11 @@
           <w:p>
             <w:pPr>
               <w:jc w:val="center"/>
-              <w:spacing w:after="0"/>
+              <w:spacing w:after="0" w:line="216" w:lineRule="auto"/>
             </w:pPr>
             <w:r>
               <w:rPr>
-                <w:sz w:val="15"/>
+                <w:sz w:val="14"/>
               </w:rPr>
               <w:t xml:space="preserve">Answer + structured results + source links/citations + follow-up questions.</w:t>
             </w:r>
@@ -4160,7 +4271,7 @@
     </w:p>
     <w:sectPr>
       <w:pgSz w:w="12240" w:h="15840"/>
-      <w:pgMar w:top="1440" w:right="1440" w:bottom="1440" w:left="1440" w:header="720" w:footer="720" w:gutter="0"/>
+      <w:pgMar w:top="1152" w:right="864" w:bottom="1152" w:left="864" w:header="720" w:footer="720" w:gutter="0"/>
     </w:sectPr>
   </w:body>
 </w:document>

</xml_diff>